<commit_message>
Jenkins Approval with Email
</commit_message>
<xml_diff>
--- a/Session-26/Jenkins Approval Pipeline.docx
+++ b/Session-26/Jenkins Approval Pipeline.docx
@@ -1874,9 +1874,1100 @@
         </w:rPr>
         <w:t>steps{</w:t>
       </w:r>
+      <w:proofErr w:type="gramEnd"/>
+    </w:p>
+    <w:p>
+      <w:pPr>
+        <w:rPr>
+          <w:lang w:val="en-US"/>
+        </w:rPr>
+      </w:pPr>
+      <w:r>
+        <w:rPr>
+          <w:lang w:val="en-US"/>
+        </w:rPr>
+        <w:t xml:space="preserve">              </w:t>
+      </w:r>
+      <w:proofErr w:type="spellStart"/>
+      <w:r>
+        <w:rPr>
+          <w:lang w:val="en-US"/>
+        </w:rPr>
+        <w:t>withSonarQubeEnv</w:t>
+      </w:r>
+      <w:proofErr w:type="spellEnd"/>
+      <w:r>
+        <w:rPr>
+          <w:lang w:val="en-US"/>
+        </w:rPr>
+        <w:t>("${SONARQUBE_ENV}</w:t>
+      </w:r>
+      <w:proofErr w:type="gramStart"/>
+      <w:r>
+        <w:rPr>
+          <w:lang w:val="en-US"/>
+        </w:rPr>
+        <w:t>"){</w:t>
+      </w:r>
+      <w:proofErr w:type="gramEnd"/>
+    </w:p>
+    <w:p>
+      <w:pPr>
+        <w:rPr>
+          <w:lang w:val="en-US"/>
+        </w:rPr>
+      </w:pPr>
+      <w:r>
+        <w:rPr>
+          <w:lang w:val="en-US"/>
+        </w:rPr>
+        <w:t xml:space="preserve">                  </w:t>
+      </w:r>
+      <w:proofErr w:type="spellStart"/>
+      <w:r>
+        <w:rPr>
+          <w:lang w:val="en-US"/>
+        </w:rPr>
+        <w:t>sh</w:t>
+      </w:r>
+      <w:proofErr w:type="spellEnd"/>
+      <w:r>
+        <w:rPr>
+          <w:lang w:val="en-US"/>
+        </w:rPr>
+        <w:t xml:space="preserve">''' </w:t>
+      </w:r>
+    </w:p>
+    <w:p>
+      <w:pPr>
+        <w:rPr>
+          <w:lang w:val="en-US"/>
+        </w:rPr>
+      </w:pPr>
+      <w:r>
+        <w:rPr>
+          <w:lang w:val="en-US"/>
+        </w:rPr>
+        <w:t xml:space="preserve">                  /opt/sonar-scanner/bin/sonar-scanner\</w:t>
+      </w:r>
+    </w:p>
+    <w:p>
+      <w:pPr>
+        <w:rPr>
+          <w:lang w:val="en-US"/>
+        </w:rPr>
+      </w:pPr>
+      <w:r>
+        <w:rPr>
+          <w:lang w:val="en-US"/>
+        </w:rPr>
+        <w:t xml:space="preserve">                  -</w:t>
+      </w:r>
+      <w:proofErr w:type="spellStart"/>
+      <w:r>
+        <w:rPr>
+          <w:lang w:val="en-US"/>
+        </w:rPr>
+        <w:t>Dsonar.projectKey</w:t>
+      </w:r>
+      <w:proofErr w:type="spellEnd"/>
+      <w:r>
+        <w:rPr>
+          <w:lang w:val="en-US"/>
+        </w:rPr>
+        <w:t>=</w:t>
+      </w:r>
+      <w:proofErr w:type="spellStart"/>
+      <w:r>
+        <w:rPr>
+          <w:lang w:val="en-US"/>
+        </w:rPr>
+        <w:t>Sonar_Python</w:t>
+      </w:r>
+      <w:proofErr w:type="spellEnd"/>
+      <w:r>
+        <w:rPr>
+          <w:lang w:val="en-US"/>
+        </w:rPr>
+        <w:t>\</w:t>
+      </w:r>
+    </w:p>
+    <w:p>
+      <w:pPr>
+        <w:rPr>
+          <w:lang w:val="en-US"/>
+        </w:rPr>
+      </w:pPr>
+      <w:r>
+        <w:rPr>
+          <w:lang w:val="en-US"/>
+        </w:rPr>
+        <w:t xml:space="preserve">                  -</w:t>
+      </w:r>
+      <w:proofErr w:type="spellStart"/>
+      <w:r>
+        <w:rPr>
+          <w:lang w:val="en-US"/>
+        </w:rPr>
+        <w:t>Dsonar.sources</w:t>
+      </w:r>
+      <w:proofErr w:type="spellEnd"/>
+      <w:r>
+        <w:rPr>
+          <w:lang w:val="en-US"/>
+        </w:rPr>
+        <w:t>=app \</w:t>
+      </w:r>
+    </w:p>
+    <w:p>
+      <w:pPr>
+        <w:rPr>
+          <w:lang w:val="en-US"/>
+        </w:rPr>
+      </w:pPr>
+      <w:r>
+        <w:rPr>
+          <w:lang w:val="en-US"/>
+        </w:rPr>
+        <w:t xml:space="preserve">                  -</w:t>
+      </w:r>
+      <w:proofErr w:type="spellStart"/>
+      <w:r>
+        <w:rPr>
+          <w:lang w:val="en-US"/>
+        </w:rPr>
+        <w:t>Dsonar.tests</w:t>
+      </w:r>
+      <w:proofErr w:type="spellEnd"/>
+      <w:r>
+        <w:rPr>
+          <w:lang w:val="en-US"/>
+        </w:rPr>
+        <w:t>=test \</w:t>
+      </w:r>
+    </w:p>
+    <w:p>
+      <w:pPr>
+        <w:rPr>
+          <w:lang w:val="en-US"/>
+        </w:rPr>
+      </w:pPr>
+      <w:r>
+        <w:rPr>
+          <w:lang w:val="en-US"/>
+        </w:rPr>
+        <w:t xml:space="preserve">                  -</w:t>
+      </w:r>
+      <w:proofErr w:type="spellStart"/>
+      <w:proofErr w:type="gramStart"/>
+      <w:r>
+        <w:rPr>
+          <w:lang w:val="en-US"/>
+        </w:rPr>
+        <w:t>Dsonar.python.version</w:t>
+      </w:r>
+      <w:proofErr w:type="spellEnd"/>
+      <w:proofErr w:type="gramEnd"/>
+      <w:r>
+        <w:rPr>
+          <w:lang w:val="en-US"/>
+        </w:rPr>
+        <w:t>=3.10 \</w:t>
+      </w:r>
+    </w:p>
+    <w:p>
+      <w:pPr>
+        <w:rPr>
+          <w:lang w:val="en-US"/>
+        </w:rPr>
+      </w:pPr>
+      <w:r>
+        <w:rPr>
+          <w:lang w:val="en-US"/>
+        </w:rPr>
+        <w:t xml:space="preserve">                  -</w:t>
+      </w:r>
+      <w:proofErr w:type="spellStart"/>
+      <w:r>
+        <w:rPr>
+          <w:lang w:val="en-US"/>
+        </w:rPr>
+        <w:t>Dsonar.token</w:t>
+      </w:r>
+      <w:proofErr w:type="spellEnd"/>
+      <w:r>
+        <w:rPr>
+          <w:lang w:val="en-US"/>
+        </w:rPr>
+        <w:t>={NEW_SONAR_TOKEN}</w:t>
+      </w:r>
+    </w:p>
+    <w:p>
+      <w:pPr>
+        <w:rPr>
+          <w:lang w:val="en-US"/>
+        </w:rPr>
+      </w:pPr>
+      <w:r>
+        <w:rPr>
+          <w:lang w:val="en-US"/>
+        </w:rPr>
+        <w:t xml:space="preserve">                  '''</w:t>
+      </w:r>
+    </w:p>
+    <w:p>
+      <w:pPr>
+        <w:rPr>
+          <w:lang w:val="en-US"/>
+        </w:rPr>
+      </w:pPr>
+      <w:r>
+        <w:rPr>
+          <w:lang w:val="en-US"/>
+        </w:rPr>
+        <w:t xml:space="preserve">              }</w:t>
+      </w:r>
+    </w:p>
+    <w:p>
+      <w:pPr>
+        <w:rPr>
+          <w:lang w:val="en-US"/>
+        </w:rPr>
+      </w:pPr>
+      <w:r>
+        <w:rPr>
+          <w:lang w:val="en-US"/>
+        </w:rPr>
+        <w:t xml:space="preserve">          }   </w:t>
+      </w:r>
+    </w:p>
+    <w:p>
+      <w:pPr>
+        <w:rPr>
+          <w:lang w:val="en-US"/>
+        </w:rPr>
+      </w:pPr>
+      <w:r>
+        <w:rPr>
+          <w:lang w:val="en-US"/>
+        </w:rPr>
+        <w:t xml:space="preserve">        }</w:t>
+      </w:r>
+    </w:p>
+    <w:p>
+      <w:pPr>
+        <w:rPr>
+          <w:lang w:val="en-US"/>
+        </w:rPr>
+      </w:pPr>
+      <w:r>
+        <w:rPr>
+          <w:lang w:val="en-US"/>
+        </w:rPr>
+        <w:t xml:space="preserve">    }</w:t>
+      </w:r>
+    </w:p>
+    <w:p>
+      <w:pPr>
+        <w:rPr>
+          <w:lang w:val="en-US"/>
+        </w:rPr>
+      </w:pPr>
+      <w:r>
+        <w:rPr>
+          <w:lang w:val="en-US"/>
+        </w:rPr>
+        <w:t>}</w:t>
+      </w:r>
+    </w:p>
+    <w:p>
+      <w:pPr>
+        <w:rPr>
+          <w:lang w:val="en-US"/>
+        </w:rPr>
+      </w:pPr>
+    </w:p>
+    <w:p>
+      <w:pPr>
+        <w:pStyle w:val="Heading1"/>
+        <w:rPr>
+          <w:lang w:val="en-US"/>
+        </w:rPr>
+      </w:pPr>
+      <w:r>
+        <w:rPr>
+          <w:lang w:val="en-US"/>
+        </w:rPr>
+        <w:t>Adding Email Approval using URL in Jenkins</w:t>
+      </w:r>
+    </w:p>
+    <w:p>
+      <w:pPr>
+        <w:rPr>
+          <w:b/>
+          <w:u w:val="single"/>
+          <w:lang w:val="en-US"/>
+        </w:rPr>
+      </w:pPr>
+      <w:r>
+        <w:rPr>
+          <w:b/>
+          <w:u w:val="single"/>
+          <w:lang w:val="en-US"/>
+        </w:rPr>
+        <w:t>Pipeline</w:t>
+      </w:r>
+    </w:p>
+    <w:p>
+      <w:pPr>
+        <w:rPr>
+          <w:lang w:val="en-US"/>
+        </w:rPr>
+      </w:pPr>
+      <w:r>
+        <w:rPr>
+          <w:lang w:val="en-US"/>
+        </w:rPr>
+        <w:t>pipeline {</w:t>
+      </w:r>
+    </w:p>
+    <w:p>
+      <w:pPr>
+        <w:rPr>
+          <w:lang w:val="en-US"/>
+        </w:rPr>
+      </w:pPr>
+      <w:r>
+        <w:rPr>
+          <w:lang w:val="en-US"/>
+        </w:rPr>
+        <w:t xml:space="preserve">    agent any</w:t>
+      </w:r>
+    </w:p>
+    <w:p>
+      <w:pPr>
+        <w:rPr>
+          <w:lang w:val="en-US"/>
+        </w:rPr>
+      </w:pPr>
+      <w:r>
+        <w:rPr>
+          <w:lang w:val="en-US"/>
+        </w:rPr>
+        <w:t xml:space="preserve">    </w:t>
+      </w:r>
+      <w:proofErr w:type="gramStart"/>
+      <w:r>
+        <w:rPr>
+          <w:lang w:val="en-US"/>
+        </w:rPr>
+        <w:t>environment{</w:t>
+      </w:r>
+      <w:proofErr w:type="gramEnd"/>
+    </w:p>
+    <w:p>
+      <w:pPr>
+        <w:rPr>
+          <w:lang w:val="en-US"/>
+        </w:rPr>
+      </w:pPr>
+      <w:r>
+        <w:rPr>
+          <w:lang w:val="en-US"/>
+        </w:rPr>
+        <w:t xml:space="preserve">        SONARQUBE_ENV='</w:t>
+      </w:r>
+      <w:proofErr w:type="spellStart"/>
+      <w:r>
+        <w:rPr>
+          <w:lang w:val="en-US"/>
+        </w:rPr>
+        <w:t>MySonar</w:t>
+      </w:r>
+      <w:proofErr w:type="spellEnd"/>
+      <w:r>
+        <w:rPr>
+          <w:lang w:val="en-US"/>
+        </w:rPr>
+        <w:t>' //</w:t>
+      </w:r>
+      <w:proofErr w:type="spellStart"/>
+      <w:r>
+        <w:rPr>
+          <w:lang w:val="en-US"/>
+        </w:rPr>
+        <w:t>jenkis</w:t>
+      </w:r>
+      <w:proofErr w:type="spellEnd"/>
+      <w:r>
+        <w:rPr>
+          <w:lang w:val="en-US"/>
+        </w:rPr>
+        <w:t>-&gt;</w:t>
+      </w:r>
+      <w:proofErr w:type="spellStart"/>
+      <w:r>
+        <w:rPr>
+          <w:lang w:val="en-US"/>
+        </w:rPr>
+        <w:t>managejenkins</w:t>
+      </w:r>
+      <w:proofErr w:type="spellEnd"/>
+      <w:r>
+        <w:rPr>
+          <w:lang w:val="en-US"/>
+        </w:rPr>
+        <w:t>-&gt;configure system</w:t>
+      </w:r>
+    </w:p>
+    <w:p>
+      <w:pPr>
+        <w:rPr>
+          <w:lang w:val="en-US"/>
+        </w:rPr>
+      </w:pPr>
+      <w:r>
+        <w:rPr>
+          <w:lang w:val="en-US"/>
+        </w:rPr>
+        <w:t xml:space="preserve">        SONAR_TOKEN=credentials('NEW_SONAR_TOKEN') //from-&gt; </w:t>
+      </w:r>
+      <w:proofErr w:type="spellStart"/>
+      <w:r>
+        <w:rPr>
+          <w:lang w:val="en-US"/>
+        </w:rPr>
+        <w:t>jenkins</w:t>
+      </w:r>
+      <w:proofErr w:type="spellEnd"/>
+      <w:r>
+        <w:rPr>
+          <w:lang w:val="en-US"/>
+        </w:rPr>
+        <w:t xml:space="preserve"> credentials</w:t>
+      </w:r>
+    </w:p>
+    <w:p>
+      <w:pPr>
+        <w:rPr>
+          <w:lang w:val="en-US"/>
+        </w:rPr>
+      </w:pPr>
+      <w:r>
+        <w:rPr>
+          <w:lang w:val="en-US"/>
+        </w:rPr>
+        <w:t xml:space="preserve">    }</w:t>
+      </w:r>
+    </w:p>
+    <w:p>
+      <w:pPr>
+        <w:rPr>
+          <w:lang w:val="en-US"/>
+        </w:rPr>
+      </w:pPr>
+    </w:p>
+    <w:p>
+      <w:pPr>
+        <w:rPr>
+          <w:lang w:val="en-US"/>
+        </w:rPr>
+      </w:pPr>
+      <w:r>
+        <w:rPr>
+          <w:lang w:val="en-US"/>
+        </w:rPr>
+        <w:t xml:space="preserve">    stages {</w:t>
+      </w:r>
       <w:bookmarkStart w:id="0" w:name="_GoBack"/>
       <w:bookmarkEnd w:id="0"/>
+    </w:p>
+    <w:p>
+      <w:pPr>
+        <w:rPr>
+          <w:lang w:val="en-US"/>
+        </w:rPr>
+      </w:pPr>
+      <w:r>
+        <w:rPr>
+          <w:lang w:val="en-US"/>
+        </w:rPr>
+        <w:t xml:space="preserve">        stage('checkout') {</w:t>
+      </w:r>
+    </w:p>
+    <w:p>
+      <w:pPr>
+        <w:rPr>
+          <w:lang w:val="en-US"/>
+        </w:rPr>
+      </w:pPr>
+      <w:r>
+        <w:rPr>
+          <w:lang w:val="en-US"/>
+        </w:rPr>
+        <w:lastRenderedPageBreak/>
+        <w:t xml:space="preserve">            steps {</w:t>
+      </w:r>
+    </w:p>
+    <w:p>
+      <w:pPr>
+        <w:rPr>
+          <w:lang w:val="en-US"/>
+        </w:rPr>
+      </w:pPr>
+      <w:r>
+        <w:rPr>
+          <w:lang w:val="en-US"/>
+        </w:rPr>
+        <w:t xml:space="preserve">                </w:t>
+      </w:r>
+      <w:proofErr w:type="spellStart"/>
+      <w:r>
+        <w:rPr>
+          <w:lang w:val="en-US"/>
+        </w:rPr>
+        <w:t>git</w:t>
+      </w:r>
+      <w:proofErr w:type="spellEnd"/>
+      <w:r>
+        <w:rPr>
+          <w:lang w:val="en-US"/>
+        </w:rPr>
+        <w:t xml:space="preserve"> url:'https://github.com/Nikunj-Java/Sonar_Python.git</w:t>
+      </w:r>
+      <w:proofErr w:type="gramStart"/>
+      <w:r>
+        <w:rPr>
+          <w:lang w:val="en-US"/>
+        </w:rPr>
+        <w:t>',branch</w:t>
+      </w:r>
       <w:proofErr w:type="gramEnd"/>
+      <w:r>
+        <w:rPr>
+          <w:lang w:val="en-US"/>
+        </w:rPr>
+        <w:t>:'main'</w:t>
+      </w:r>
+    </w:p>
+    <w:p>
+      <w:pPr>
+        <w:rPr>
+          <w:lang w:val="en-US"/>
+        </w:rPr>
+      </w:pPr>
+      <w:r>
+        <w:rPr>
+          <w:lang w:val="en-US"/>
+        </w:rPr>
+        <w:t xml:space="preserve">            }</w:t>
+      </w:r>
+    </w:p>
+    <w:p>
+      <w:pPr>
+        <w:rPr>
+          <w:lang w:val="en-US"/>
+        </w:rPr>
+      </w:pPr>
+      <w:r>
+        <w:rPr>
+          <w:lang w:val="en-US"/>
+        </w:rPr>
+        <w:t xml:space="preserve">        }</w:t>
+      </w:r>
+    </w:p>
+    <w:p>
+      <w:pPr>
+        <w:rPr>
+          <w:lang w:val="en-US"/>
+        </w:rPr>
+      </w:pPr>
+      <w:r>
+        <w:rPr>
+          <w:lang w:val="en-US"/>
+        </w:rPr>
+        <w:t xml:space="preserve">        </w:t>
+      </w:r>
+      <w:proofErr w:type="gramStart"/>
+      <w:r>
+        <w:rPr>
+          <w:lang w:val="en-US"/>
+        </w:rPr>
+        <w:t>stage(</w:t>
+      </w:r>
+      <w:proofErr w:type="gramEnd"/>
+      <w:r>
+        <w:rPr>
+          <w:lang w:val="en-US"/>
+        </w:rPr>
+        <w:t>'Email Approval'){</w:t>
+      </w:r>
+    </w:p>
+    <w:p>
+      <w:pPr>
+        <w:rPr>
+          <w:lang w:val="en-US"/>
+        </w:rPr>
+      </w:pPr>
+      <w:r>
+        <w:rPr>
+          <w:lang w:val="en-US"/>
+        </w:rPr>
+        <w:t xml:space="preserve">            </w:t>
+      </w:r>
+      <w:proofErr w:type="gramStart"/>
+      <w:r>
+        <w:rPr>
+          <w:lang w:val="en-US"/>
+        </w:rPr>
+        <w:t>steps{</w:t>
+      </w:r>
+      <w:proofErr w:type="gramEnd"/>
+    </w:p>
+    <w:p>
+      <w:pPr>
+        <w:rPr>
+          <w:lang w:val="en-US"/>
+        </w:rPr>
+      </w:pPr>
+      <w:r>
+        <w:rPr>
+          <w:lang w:val="en-US"/>
+        </w:rPr>
+        <w:t xml:space="preserve">                mail to:'ganitniduniyanikunj10@gmail.com',</w:t>
+      </w:r>
+    </w:p>
+    <w:p>
+      <w:pPr>
+        <w:rPr>
+          <w:lang w:val="en-US"/>
+        </w:rPr>
+      </w:pPr>
+      <w:r>
+        <w:rPr>
+          <w:lang w:val="en-US"/>
+        </w:rPr>
+        <w:t xml:space="preserve">                </w:t>
+      </w:r>
+      <w:proofErr w:type="spellStart"/>
+      <w:r>
+        <w:rPr>
+          <w:lang w:val="en-US"/>
+        </w:rPr>
+        <w:t>subject:'Approval</w:t>
+      </w:r>
+      <w:proofErr w:type="spellEnd"/>
+      <w:r>
+        <w:rPr>
+          <w:lang w:val="en-US"/>
+        </w:rPr>
+        <w:t xml:space="preserve"> Needed for Production Deployment',</w:t>
+      </w:r>
+    </w:p>
+    <w:p>
+      <w:pPr>
+        <w:rPr>
+          <w:lang w:val="en-US"/>
+        </w:rPr>
+      </w:pPr>
+      <w:r>
+        <w:rPr>
+          <w:lang w:val="en-US"/>
+        </w:rPr>
+        <w:t xml:space="preserve">                body:"""\</w:t>
+      </w:r>
+    </w:p>
+    <w:p>
+      <w:pPr>
+        <w:rPr>
+          <w:lang w:val="en-US"/>
+        </w:rPr>
+      </w:pPr>
+      <w:r>
+        <w:rPr>
+          <w:lang w:val="en-US"/>
+        </w:rPr>
+        <w:t xml:space="preserve">                Build #${</w:t>
+      </w:r>
+      <w:proofErr w:type="spellStart"/>
+      <w:proofErr w:type="gramStart"/>
+      <w:r>
+        <w:rPr>
+          <w:lang w:val="en-US"/>
+        </w:rPr>
+        <w:t>env.BUILD</w:t>
+      </w:r>
+      <w:proofErr w:type="gramEnd"/>
+      <w:r>
+        <w:rPr>
+          <w:lang w:val="en-US"/>
+        </w:rPr>
+        <w:t>_NUMBER</w:t>
+      </w:r>
+      <w:proofErr w:type="spellEnd"/>
+      <w:r>
+        <w:rPr>
+          <w:lang w:val="en-US"/>
+        </w:rPr>
+        <w:t>} is ready for Production Kindly Approve.</w:t>
+      </w:r>
+    </w:p>
+    <w:p>
+      <w:pPr>
+        <w:rPr>
+          <w:lang w:val="en-US"/>
+        </w:rPr>
+      </w:pPr>
+      <w:r>
+        <w:rPr>
+          <w:lang w:val="en-US"/>
+        </w:rPr>
+        <w:t xml:space="preserve">                </w:t>
+      </w:r>
+    </w:p>
+    <w:p>
+      <w:pPr>
+        <w:rPr>
+          <w:lang w:val="en-US"/>
+        </w:rPr>
+      </w:pPr>
+      <w:r>
+        <w:rPr>
+          <w:lang w:val="en-US"/>
+        </w:rPr>
+        <w:t xml:space="preserve">                click the following link to approve:</w:t>
+      </w:r>
+    </w:p>
+    <w:p>
+      <w:pPr>
+        <w:rPr>
+          <w:lang w:val="en-US"/>
+        </w:rPr>
+      </w:pPr>
+      <w:r>
+        <w:rPr>
+          <w:lang w:val="en-US"/>
+        </w:rPr>
+        <w:t xml:space="preserve">                ${</w:t>
+      </w:r>
+      <w:proofErr w:type="spellStart"/>
+      <w:proofErr w:type="gramStart"/>
+      <w:r>
+        <w:rPr>
+          <w:lang w:val="en-US"/>
+        </w:rPr>
+        <w:t>env.BUILD</w:t>
+      </w:r>
+      <w:proofErr w:type="gramEnd"/>
+      <w:r>
+        <w:rPr>
+          <w:lang w:val="en-US"/>
+        </w:rPr>
+        <w:t>_URL</w:t>
+      </w:r>
+      <w:proofErr w:type="spellEnd"/>
+      <w:r>
+        <w:rPr>
+          <w:lang w:val="en-US"/>
+        </w:rPr>
+        <w:t>}</w:t>
+      </w:r>
+    </w:p>
+    <w:p>
+      <w:pPr>
+        <w:rPr>
+          <w:lang w:val="en-US"/>
+        </w:rPr>
+      </w:pPr>
+      <w:r>
+        <w:rPr>
+          <w:lang w:val="en-US"/>
+        </w:rPr>
+        <w:t xml:space="preserve">                </w:t>
+      </w:r>
+    </w:p>
+    <w:p>
+      <w:pPr>
+        <w:rPr>
+          <w:lang w:val="en-US"/>
+        </w:rPr>
+      </w:pPr>
+      <w:r>
+        <w:rPr>
+          <w:lang w:val="en-US"/>
+        </w:rPr>
+        <w:t xml:space="preserve">                login and click "Proceed" in the "Approval" Stage</w:t>
+      </w:r>
+    </w:p>
+    <w:p>
+      <w:pPr>
+        <w:rPr>
+          <w:lang w:val="en-US"/>
+        </w:rPr>
+      </w:pPr>
+      <w:r>
+        <w:rPr>
+          <w:lang w:val="en-US"/>
+        </w:rPr>
+        <w:t xml:space="preserve">                """</w:t>
+      </w:r>
+    </w:p>
+    <w:p>
+      <w:pPr>
+        <w:rPr>
+          <w:lang w:val="en-US"/>
+        </w:rPr>
+      </w:pPr>
+      <w:r>
+        <w:rPr>
+          <w:lang w:val="en-US"/>
+        </w:rPr>
+        <w:t xml:space="preserve">            }</w:t>
+      </w:r>
+    </w:p>
+    <w:p>
+      <w:pPr>
+        <w:rPr>
+          <w:lang w:val="en-US"/>
+        </w:rPr>
+      </w:pPr>
+      <w:r>
+        <w:rPr>
+          <w:lang w:val="en-US"/>
+        </w:rPr>
+        <w:t xml:space="preserve">        }</w:t>
+      </w:r>
+    </w:p>
+    <w:p>
+      <w:pPr>
+        <w:rPr>
+          <w:lang w:val="en-US"/>
+        </w:rPr>
+      </w:pPr>
+      <w:r>
+        <w:rPr>
+          <w:lang w:val="en-US"/>
+        </w:rPr>
+        <w:t xml:space="preserve">        </w:t>
+      </w:r>
+      <w:proofErr w:type="gramStart"/>
+      <w:r>
+        <w:rPr>
+          <w:lang w:val="en-US"/>
+        </w:rPr>
+        <w:t>stage(</w:t>
+      </w:r>
+      <w:proofErr w:type="gramEnd"/>
+      <w:r>
+        <w:rPr>
+          <w:lang w:val="en-US"/>
+        </w:rPr>
+        <w:t>'Approval Before Sonar Analysis'){</w:t>
+      </w:r>
+    </w:p>
+    <w:p>
+      <w:pPr>
+        <w:rPr>
+          <w:lang w:val="en-US"/>
+        </w:rPr>
+      </w:pPr>
+      <w:r>
+        <w:rPr>
+          <w:lang w:val="en-US"/>
+        </w:rPr>
+        <w:t xml:space="preserve">            </w:t>
+      </w:r>
+      <w:proofErr w:type="gramStart"/>
+      <w:r>
+        <w:rPr>
+          <w:lang w:val="en-US"/>
+        </w:rPr>
+        <w:t>steps{</w:t>
+      </w:r>
+      <w:proofErr w:type="gramEnd"/>
+    </w:p>
+    <w:p>
+      <w:pPr>
+        <w:rPr>
+          <w:lang w:val="en-US"/>
+        </w:rPr>
+      </w:pPr>
+      <w:r>
+        <w:rPr>
+          <w:lang w:val="en-US"/>
+        </w:rPr>
+        <w:t xml:space="preserve">                timeout(time:</w:t>
+      </w:r>
+      <w:proofErr w:type="gramStart"/>
+      <w:r>
+        <w:rPr>
+          <w:lang w:val="en-US"/>
+        </w:rPr>
+        <w:t>10,unit</w:t>
+      </w:r>
+      <w:proofErr w:type="gramEnd"/>
+      <w:r>
+        <w:rPr>
+          <w:lang w:val="en-US"/>
+        </w:rPr>
+        <w:t>:'MINUTES'){</w:t>
+      </w:r>
+    </w:p>
+    <w:p>
+      <w:pPr>
+        <w:rPr>
+          <w:lang w:val="en-US"/>
+        </w:rPr>
+      </w:pPr>
+      <w:r>
+        <w:rPr>
+          <w:lang w:val="en-US"/>
+        </w:rPr>
+        <w:t xml:space="preserve">                    input message: 'Approve to run </w:t>
+      </w:r>
+      <w:proofErr w:type="spellStart"/>
+      <w:r>
+        <w:rPr>
+          <w:lang w:val="en-US"/>
+        </w:rPr>
+        <w:t>SonarQube</w:t>
+      </w:r>
+      <w:proofErr w:type="spellEnd"/>
+      <w:r>
+        <w:rPr>
+          <w:lang w:val="en-US"/>
+        </w:rPr>
+        <w:t xml:space="preserve"> Analysis? </w:t>
+      </w:r>
+      <w:proofErr w:type="gramStart"/>
+      <w:r>
+        <w:rPr>
+          <w:lang w:val="en-US"/>
+        </w:rPr>
+        <w:t>',</w:t>
+      </w:r>
+      <w:proofErr w:type="spellStart"/>
+      <w:r>
+        <w:rPr>
+          <w:lang w:val="en-US"/>
+        </w:rPr>
+        <w:t>ok</w:t>
+      </w:r>
+      <w:proofErr w:type="gramEnd"/>
+      <w:r>
+        <w:rPr>
+          <w:lang w:val="en-US"/>
+        </w:rPr>
+        <w:t>:'Run</w:t>
+      </w:r>
+      <w:proofErr w:type="spellEnd"/>
+      <w:r>
+        <w:rPr>
+          <w:lang w:val="en-US"/>
+        </w:rPr>
+        <w:t xml:space="preserve"> Analysis'</w:t>
+      </w:r>
+    </w:p>
+    <w:p>
+      <w:pPr>
+        <w:rPr>
+          <w:lang w:val="en-US"/>
+        </w:rPr>
+      </w:pPr>
+      <w:r>
+        <w:rPr>
+          <w:lang w:val="en-US"/>
+        </w:rPr>
+        <w:t xml:space="preserve">                }</w:t>
+      </w:r>
+    </w:p>
+    <w:p>
+      <w:pPr>
+        <w:rPr>
+          <w:lang w:val="en-US"/>
+        </w:rPr>
+      </w:pPr>
+      <w:r>
+        <w:rPr>
+          <w:lang w:val="en-US"/>
+        </w:rPr>
+        <w:t xml:space="preserve">            }</w:t>
+      </w:r>
+    </w:p>
+    <w:p>
+      <w:pPr>
+        <w:rPr>
+          <w:lang w:val="en-US"/>
+        </w:rPr>
+      </w:pPr>
+      <w:r>
+        <w:rPr>
+          <w:lang w:val="en-US"/>
+        </w:rPr>
+        <w:t xml:space="preserve">        }</w:t>
+      </w:r>
+    </w:p>
+    <w:p>
+      <w:pPr>
+        <w:rPr>
+          <w:lang w:val="en-US"/>
+        </w:rPr>
+      </w:pPr>
+      <w:r>
+        <w:rPr>
+          <w:lang w:val="en-US"/>
+        </w:rPr>
+        <w:t xml:space="preserve">        </w:t>
+      </w:r>
+      <w:proofErr w:type="gramStart"/>
+      <w:r>
+        <w:rPr>
+          <w:lang w:val="en-US"/>
+        </w:rPr>
+        <w:t>stage(</w:t>
+      </w:r>
+      <w:proofErr w:type="gramEnd"/>
+      <w:r>
+        <w:rPr>
+          <w:lang w:val="en-US"/>
+        </w:rPr>
+        <w:t>'</w:t>
+      </w:r>
+      <w:proofErr w:type="spellStart"/>
+      <w:r>
+        <w:rPr>
+          <w:lang w:val="en-US"/>
+        </w:rPr>
+        <w:t>SonarQube</w:t>
+      </w:r>
+      <w:proofErr w:type="spellEnd"/>
+      <w:r>
+        <w:rPr>
+          <w:lang w:val="en-US"/>
+        </w:rPr>
+        <w:t xml:space="preserve"> Analysis'){</w:t>
+      </w:r>
+    </w:p>
+    <w:p>
+      <w:pPr>
+        <w:rPr>
+          <w:lang w:val="en-US"/>
+        </w:rPr>
+      </w:pPr>
+      <w:r>
+        <w:rPr>
+          <w:lang w:val="en-US"/>
+        </w:rPr>
+        <w:t xml:space="preserve">          </w:t>
+      </w:r>
+      <w:proofErr w:type="gramStart"/>
+      <w:r>
+        <w:rPr>
+          <w:lang w:val="en-US"/>
+        </w:rPr>
+        <w:t>steps{</w:t>
+      </w:r>
+      <w:proofErr w:type="gramEnd"/>
     </w:p>
     <w:p>
       <w:pPr>
@@ -2004,6 +3095,7 @@
         <w:rPr>
           <w:lang w:val="en-US"/>
         </w:rPr>
+        <w:lastRenderedPageBreak/>
         <w:t xml:space="preserve">                  -</w:t>
       </w:r>
       <w:proofErr w:type="spellStart"/>
@@ -2181,13 +3273,6 @@
         </w:rPr>
         <w:t>}</w:t>
       </w:r>
-    </w:p>
-    <w:p>
-      <w:pPr>
-        <w:rPr>
-          <w:lang w:val="en-US"/>
-        </w:rPr>
-      </w:pPr>
     </w:p>
     <w:sectPr>
       <w:pgSz w:w="11906" w:h="16838"/>

</xml_diff>

<commit_message>
Jenkins Approval with Email and Post Build Actions
</commit_message>
<xml_diff>
--- a/Session-26/Jenkins Approval Pipeline.docx
+++ b/Session-26/Jenkins Approval Pipeline.docx
@@ -2379,900 +2379,3146 @@
         </w:rPr>
         <w:t xml:space="preserve">    stages {</w:t>
       </w:r>
+    </w:p>
+    <w:p>
+      <w:pPr>
+        <w:rPr>
+          <w:lang w:val="en-US"/>
+        </w:rPr>
+      </w:pPr>
+      <w:r>
+        <w:rPr>
+          <w:lang w:val="en-US"/>
+        </w:rPr>
+        <w:t xml:space="preserve">        stage('checkout') {</w:t>
+      </w:r>
+    </w:p>
+    <w:p>
+      <w:pPr>
+        <w:rPr>
+          <w:lang w:val="en-US"/>
+        </w:rPr>
+      </w:pPr>
+      <w:r>
+        <w:rPr>
+          <w:lang w:val="en-US"/>
+        </w:rPr>
+        <w:lastRenderedPageBreak/>
+        <w:t xml:space="preserve">            steps {</w:t>
+      </w:r>
+    </w:p>
+    <w:p>
+      <w:pPr>
+        <w:rPr>
+          <w:lang w:val="en-US"/>
+        </w:rPr>
+      </w:pPr>
+      <w:r>
+        <w:rPr>
+          <w:lang w:val="en-US"/>
+        </w:rPr>
+        <w:t xml:space="preserve">                </w:t>
+      </w:r>
+      <w:proofErr w:type="spellStart"/>
+      <w:r>
+        <w:rPr>
+          <w:lang w:val="en-US"/>
+        </w:rPr>
+        <w:t>git</w:t>
+      </w:r>
+      <w:proofErr w:type="spellEnd"/>
+      <w:r>
+        <w:rPr>
+          <w:lang w:val="en-US"/>
+        </w:rPr>
+        <w:t xml:space="preserve"> url:'https://github.com/Nikunj-Java/Sonar_Python.git</w:t>
+      </w:r>
+      <w:proofErr w:type="gramStart"/>
+      <w:r>
+        <w:rPr>
+          <w:lang w:val="en-US"/>
+        </w:rPr>
+        <w:t>',branch</w:t>
+      </w:r>
+      <w:proofErr w:type="gramEnd"/>
+      <w:r>
+        <w:rPr>
+          <w:lang w:val="en-US"/>
+        </w:rPr>
+        <w:t>:'main'</w:t>
+      </w:r>
+    </w:p>
+    <w:p>
+      <w:pPr>
+        <w:rPr>
+          <w:lang w:val="en-US"/>
+        </w:rPr>
+      </w:pPr>
+      <w:r>
+        <w:rPr>
+          <w:lang w:val="en-US"/>
+        </w:rPr>
+        <w:t xml:space="preserve">            }</w:t>
+      </w:r>
+    </w:p>
+    <w:p>
+      <w:pPr>
+        <w:rPr>
+          <w:lang w:val="en-US"/>
+        </w:rPr>
+      </w:pPr>
+      <w:r>
+        <w:rPr>
+          <w:lang w:val="en-US"/>
+        </w:rPr>
+        <w:t xml:space="preserve">        }</w:t>
+      </w:r>
+    </w:p>
+    <w:p>
+      <w:pPr>
+        <w:rPr>
+          <w:lang w:val="en-US"/>
+        </w:rPr>
+      </w:pPr>
+      <w:r>
+        <w:rPr>
+          <w:lang w:val="en-US"/>
+        </w:rPr>
+        <w:t xml:space="preserve">        </w:t>
+      </w:r>
+      <w:proofErr w:type="gramStart"/>
+      <w:r>
+        <w:rPr>
+          <w:lang w:val="en-US"/>
+        </w:rPr>
+        <w:t>stage(</w:t>
+      </w:r>
+      <w:proofErr w:type="gramEnd"/>
+      <w:r>
+        <w:rPr>
+          <w:lang w:val="en-US"/>
+        </w:rPr>
+        <w:t>'Email Approval'){</w:t>
+      </w:r>
+    </w:p>
+    <w:p>
+      <w:pPr>
+        <w:rPr>
+          <w:lang w:val="en-US"/>
+        </w:rPr>
+      </w:pPr>
+      <w:r>
+        <w:rPr>
+          <w:lang w:val="en-US"/>
+        </w:rPr>
+        <w:t xml:space="preserve">            </w:t>
+      </w:r>
+      <w:proofErr w:type="gramStart"/>
+      <w:r>
+        <w:rPr>
+          <w:lang w:val="en-US"/>
+        </w:rPr>
+        <w:t>steps{</w:t>
+      </w:r>
+      <w:proofErr w:type="gramEnd"/>
+    </w:p>
+    <w:p>
+      <w:pPr>
+        <w:rPr>
+          <w:lang w:val="en-US"/>
+        </w:rPr>
+      </w:pPr>
+      <w:r>
+        <w:rPr>
+          <w:lang w:val="en-US"/>
+        </w:rPr>
+        <w:t xml:space="preserve">                mail to:'ganitniduniyanikunj10@gmail.com',</w:t>
+      </w:r>
+    </w:p>
+    <w:p>
+      <w:pPr>
+        <w:rPr>
+          <w:lang w:val="en-US"/>
+        </w:rPr>
+      </w:pPr>
+      <w:r>
+        <w:rPr>
+          <w:lang w:val="en-US"/>
+        </w:rPr>
+        <w:t xml:space="preserve">                </w:t>
+      </w:r>
+      <w:proofErr w:type="spellStart"/>
+      <w:r>
+        <w:rPr>
+          <w:lang w:val="en-US"/>
+        </w:rPr>
+        <w:t>subject:'Approval</w:t>
+      </w:r>
+      <w:proofErr w:type="spellEnd"/>
+      <w:r>
+        <w:rPr>
+          <w:lang w:val="en-US"/>
+        </w:rPr>
+        <w:t xml:space="preserve"> Needed for Production Deployment',</w:t>
+      </w:r>
+    </w:p>
+    <w:p>
+      <w:pPr>
+        <w:rPr>
+          <w:lang w:val="en-US"/>
+        </w:rPr>
+      </w:pPr>
+      <w:r>
+        <w:rPr>
+          <w:lang w:val="en-US"/>
+        </w:rPr>
+        <w:t xml:space="preserve">                body:"""\</w:t>
+      </w:r>
+    </w:p>
+    <w:p>
+      <w:pPr>
+        <w:rPr>
+          <w:lang w:val="en-US"/>
+        </w:rPr>
+      </w:pPr>
+      <w:r>
+        <w:rPr>
+          <w:lang w:val="en-US"/>
+        </w:rPr>
+        <w:t xml:space="preserve">                Build #${</w:t>
+      </w:r>
+      <w:proofErr w:type="spellStart"/>
+      <w:proofErr w:type="gramStart"/>
+      <w:r>
+        <w:rPr>
+          <w:lang w:val="en-US"/>
+        </w:rPr>
+        <w:t>env.BUILD</w:t>
+      </w:r>
+      <w:proofErr w:type="gramEnd"/>
+      <w:r>
+        <w:rPr>
+          <w:lang w:val="en-US"/>
+        </w:rPr>
+        <w:t>_NUMBER</w:t>
+      </w:r>
+      <w:proofErr w:type="spellEnd"/>
+      <w:r>
+        <w:rPr>
+          <w:lang w:val="en-US"/>
+        </w:rPr>
+        <w:t>} is ready for Production Kindly Approve.</w:t>
+      </w:r>
+    </w:p>
+    <w:p>
+      <w:pPr>
+        <w:rPr>
+          <w:lang w:val="en-US"/>
+        </w:rPr>
+      </w:pPr>
+      <w:r>
+        <w:rPr>
+          <w:lang w:val="en-US"/>
+        </w:rPr>
+        <w:t xml:space="preserve">                </w:t>
+      </w:r>
+    </w:p>
+    <w:p>
+      <w:pPr>
+        <w:rPr>
+          <w:lang w:val="en-US"/>
+        </w:rPr>
+      </w:pPr>
+      <w:r>
+        <w:rPr>
+          <w:lang w:val="en-US"/>
+        </w:rPr>
+        <w:t xml:space="preserve">                click the following link to approve:</w:t>
+      </w:r>
+    </w:p>
+    <w:p>
+      <w:pPr>
+        <w:rPr>
+          <w:lang w:val="en-US"/>
+        </w:rPr>
+      </w:pPr>
+      <w:r>
+        <w:rPr>
+          <w:lang w:val="en-US"/>
+        </w:rPr>
+        <w:t xml:space="preserve">                ${</w:t>
+      </w:r>
+      <w:proofErr w:type="spellStart"/>
+      <w:proofErr w:type="gramStart"/>
+      <w:r>
+        <w:rPr>
+          <w:lang w:val="en-US"/>
+        </w:rPr>
+        <w:t>env.BUILD</w:t>
+      </w:r>
+      <w:proofErr w:type="gramEnd"/>
+      <w:r>
+        <w:rPr>
+          <w:lang w:val="en-US"/>
+        </w:rPr>
+        <w:t>_URL</w:t>
+      </w:r>
+      <w:proofErr w:type="spellEnd"/>
+      <w:r>
+        <w:rPr>
+          <w:lang w:val="en-US"/>
+        </w:rPr>
+        <w:t>}</w:t>
+      </w:r>
+    </w:p>
+    <w:p>
+      <w:pPr>
+        <w:rPr>
+          <w:lang w:val="en-US"/>
+        </w:rPr>
+      </w:pPr>
+      <w:r>
+        <w:rPr>
+          <w:lang w:val="en-US"/>
+        </w:rPr>
+        <w:t xml:space="preserve">                </w:t>
+      </w:r>
+    </w:p>
+    <w:p>
+      <w:pPr>
+        <w:rPr>
+          <w:lang w:val="en-US"/>
+        </w:rPr>
+      </w:pPr>
+      <w:r>
+        <w:rPr>
+          <w:lang w:val="en-US"/>
+        </w:rPr>
+        <w:t xml:space="preserve">                login and click "Proceed" in the "Approval" Stage</w:t>
+      </w:r>
+    </w:p>
+    <w:p>
+      <w:pPr>
+        <w:rPr>
+          <w:lang w:val="en-US"/>
+        </w:rPr>
+      </w:pPr>
+      <w:r>
+        <w:rPr>
+          <w:lang w:val="en-US"/>
+        </w:rPr>
+        <w:t xml:space="preserve">                """</w:t>
+      </w:r>
+    </w:p>
+    <w:p>
+      <w:pPr>
+        <w:rPr>
+          <w:lang w:val="en-US"/>
+        </w:rPr>
+      </w:pPr>
+      <w:r>
+        <w:rPr>
+          <w:lang w:val="en-US"/>
+        </w:rPr>
+        <w:t xml:space="preserve">            }</w:t>
+      </w:r>
+    </w:p>
+    <w:p>
+      <w:pPr>
+        <w:rPr>
+          <w:lang w:val="en-US"/>
+        </w:rPr>
+      </w:pPr>
+      <w:r>
+        <w:rPr>
+          <w:lang w:val="en-US"/>
+        </w:rPr>
+        <w:t xml:space="preserve">        }</w:t>
+      </w:r>
+    </w:p>
+    <w:p>
+      <w:pPr>
+        <w:rPr>
+          <w:lang w:val="en-US"/>
+        </w:rPr>
+      </w:pPr>
+      <w:r>
+        <w:rPr>
+          <w:lang w:val="en-US"/>
+        </w:rPr>
+        <w:t xml:space="preserve">        </w:t>
+      </w:r>
+      <w:proofErr w:type="gramStart"/>
+      <w:r>
+        <w:rPr>
+          <w:lang w:val="en-US"/>
+        </w:rPr>
+        <w:t>stage(</w:t>
+      </w:r>
+      <w:proofErr w:type="gramEnd"/>
+      <w:r>
+        <w:rPr>
+          <w:lang w:val="en-US"/>
+        </w:rPr>
+        <w:t>'Approval Before Sonar Analysis'){</w:t>
+      </w:r>
+    </w:p>
+    <w:p>
+      <w:pPr>
+        <w:rPr>
+          <w:lang w:val="en-US"/>
+        </w:rPr>
+      </w:pPr>
+      <w:r>
+        <w:rPr>
+          <w:lang w:val="en-US"/>
+        </w:rPr>
+        <w:t xml:space="preserve">            </w:t>
+      </w:r>
+      <w:proofErr w:type="gramStart"/>
+      <w:r>
+        <w:rPr>
+          <w:lang w:val="en-US"/>
+        </w:rPr>
+        <w:t>steps{</w:t>
+      </w:r>
+      <w:proofErr w:type="gramEnd"/>
+    </w:p>
+    <w:p>
+      <w:pPr>
+        <w:rPr>
+          <w:lang w:val="en-US"/>
+        </w:rPr>
+      </w:pPr>
+      <w:r>
+        <w:rPr>
+          <w:lang w:val="en-US"/>
+        </w:rPr>
+        <w:t xml:space="preserve">                timeout(time:</w:t>
+      </w:r>
+      <w:proofErr w:type="gramStart"/>
+      <w:r>
+        <w:rPr>
+          <w:lang w:val="en-US"/>
+        </w:rPr>
+        <w:t>10,unit</w:t>
+      </w:r>
+      <w:proofErr w:type="gramEnd"/>
+      <w:r>
+        <w:rPr>
+          <w:lang w:val="en-US"/>
+        </w:rPr>
+        <w:t>:'MINUTES'){</w:t>
+      </w:r>
+    </w:p>
+    <w:p>
+      <w:pPr>
+        <w:rPr>
+          <w:lang w:val="en-US"/>
+        </w:rPr>
+      </w:pPr>
+      <w:r>
+        <w:rPr>
+          <w:lang w:val="en-US"/>
+        </w:rPr>
+        <w:t xml:space="preserve">                    input message: 'Approve to run </w:t>
+      </w:r>
+      <w:proofErr w:type="spellStart"/>
+      <w:r>
+        <w:rPr>
+          <w:lang w:val="en-US"/>
+        </w:rPr>
+        <w:t>SonarQube</w:t>
+      </w:r>
+      <w:proofErr w:type="spellEnd"/>
+      <w:r>
+        <w:rPr>
+          <w:lang w:val="en-US"/>
+        </w:rPr>
+        <w:t xml:space="preserve"> Analysis? </w:t>
+      </w:r>
+      <w:proofErr w:type="gramStart"/>
+      <w:r>
+        <w:rPr>
+          <w:lang w:val="en-US"/>
+        </w:rPr>
+        <w:t>',</w:t>
+      </w:r>
+      <w:proofErr w:type="spellStart"/>
+      <w:r>
+        <w:rPr>
+          <w:lang w:val="en-US"/>
+        </w:rPr>
+        <w:t>ok</w:t>
+      </w:r>
+      <w:proofErr w:type="gramEnd"/>
+      <w:r>
+        <w:rPr>
+          <w:lang w:val="en-US"/>
+        </w:rPr>
+        <w:t>:'Run</w:t>
+      </w:r>
+      <w:proofErr w:type="spellEnd"/>
+      <w:r>
+        <w:rPr>
+          <w:lang w:val="en-US"/>
+        </w:rPr>
+        <w:t xml:space="preserve"> Analysis'</w:t>
+      </w:r>
+    </w:p>
+    <w:p>
+      <w:pPr>
+        <w:rPr>
+          <w:lang w:val="en-US"/>
+        </w:rPr>
+      </w:pPr>
+      <w:r>
+        <w:rPr>
+          <w:lang w:val="en-US"/>
+        </w:rPr>
+        <w:t xml:space="preserve">                }</w:t>
+      </w:r>
+    </w:p>
+    <w:p>
+      <w:pPr>
+        <w:rPr>
+          <w:lang w:val="en-US"/>
+        </w:rPr>
+      </w:pPr>
+      <w:r>
+        <w:rPr>
+          <w:lang w:val="en-US"/>
+        </w:rPr>
+        <w:t xml:space="preserve">            }</w:t>
+      </w:r>
+    </w:p>
+    <w:p>
+      <w:pPr>
+        <w:rPr>
+          <w:lang w:val="en-US"/>
+        </w:rPr>
+      </w:pPr>
+      <w:r>
+        <w:rPr>
+          <w:lang w:val="en-US"/>
+        </w:rPr>
+        <w:t xml:space="preserve">        }</w:t>
+      </w:r>
+    </w:p>
+    <w:p>
+      <w:pPr>
+        <w:rPr>
+          <w:lang w:val="en-US"/>
+        </w:rPr>
+      </w:pPr>
+      <w:r>
+        <w:rPr>
+          <w:lang w:val="en-US"/>
+        </w:rPr>
+        <w:t xml:space="preserve">        </w:t>
+      </w:r>
+      <w:proofErr w:type="gramStart"/>
+      <w:r>
+        <w:rPr>
+          <w:lang w:val="en-US"/>
+        </w:rPr>
+        <w:t>stage(</w:t>
+      </w:r>
+      <w:proofErr w:type="gramEnd"/>
+      <w:r>
+        <w:rPr>
+          <w:lang w:val="en-US"/>
+        </w:rPr>
+        <w:t>'</w:t>
+      </w:r>
+      <w:proofErr w:type="spellStart"/>
+      <w:r>
+        <w:rPr>
+          <w:lang w:val="en-US"/>
+        </w:rPr>
+        <w:t>SonarQube</w:t>
+      </w:r>
+      <w:proofErr w:type="spellEnd"/>
+      <w:r>
+        <w:rPr>
+          <w:lang w:val="en-US"/>
+        </w:rPr>
+        <w:t xml:space="preserve"> Analysis'){</w:t>
+      </w:r>
+    </w:p>
+    <w:p>
+      <w:pPr>
+        <w:rPr>
+          <w:lang w:val="en-US"/>
+        </w:rPr>
+      </w:pPr>
+      <w:r>
+        <w:rPr>
+          <w:lang w:val="en-US"/>
+        </w:rPr>
+        <w:t xml:space="preserve">          </w:t>
+      </w:r>
+      <w:proofErr w:type="gramStart"/>
+      <w:r>
+        <w:rPr>
+          <w:lang w:val="en-US"/>
+        </w:rPr>
+        <w:t>steps{</w:t>
+      </w:r>
+      <w:proofErr w:type="gramEnd"/>
+    </w:p>
+    <w:p>
+      <w:pPr>
+        <w:rPr>
+          <w:lang w:val="en-US"/>
+        </w:rPr>
+      </w:pPr>
+      <w:r>
+        <w:rPr>
+          <w:lang w:val="en-US"/>
+        </w:rPr>
+        <w:t xml:space="preserve">              </w:t>
+      </w:r>
+      <w:proofErr w:type="spellStart"/>
+      <w:r>
+        <w:rPr>
+          <w:lang w:val="en-US"/>
+        </w:rPr>
+        <w:t>withSonarQubeEnv</w:t>
+      </w:r>
+      <w:proofErr w:type="spellEnd"/>
+      <w:r>
+        <w:rPr>
+          <w:lang w:val="en-US"/>
+        </w:rPr>
+        <w:t>("${SONARQUBE_ENV}</w:t>
+      </w:r>
+      <w:proofErr w:type="gramStart"/>
+      <w:r>
+        <w:rPr>
+          <w:lang w:val="en-US"/>
+        </w:rPr>
+        <w:t>"){</w:t>
+      </w:r>
+      <w:proofErr w:type="gramEnd"/>
+    </w:p>
+    <w:p>
+      <w:pPr>
+        <w:rPr>
+          <w:lang w:val="en-US"/>
+        </w:rPr>
+      </w:pPr>
+      <w:r>
+        <w:rPr>
+          <w:lang w:val="en-US"/>
+        </w:rPr>
+        <w:t xml:space="preserve">                  </w:t>
+      </w:r>
+      <w:proofErr w:type="spellStart"/>
+      <w:r>
+        <w:rPr>
+          <w:lang w:val="en-US"/>
+        </w:rPr>
+        <w:t>sh</w:t>
+      </w:r>
+      <w:proofErr w:type="spellEnd"/>
+      <w:r>
+        <w:rPr>
+          <w:lang w:val="en-US"/>
+        </w:rPr>
+        <w:t xml:space="preserve">''' </w:t>
+      </w:r>
+    </w:p>
+    <w:p>
+      <w:pPr>
+        <w:rPr>
+          <w:lang w:val="en-US"/>
+        </w:rPr>
+      </w:pPr>
+      <w:r>
+        <w:rPr>
+          <w:lang w:val="en-US"/>
+        </w:rPr>
+        <w:t xml:space="preserve">                  /opt/sonar-scanner/bin/sonar-scanner\</w:t>
+      </w:r>
+    </w:p>
+    <w:p>
+      <w:pPr>
+        <w:rPr>
+          <w:lang w:val="en-US"/>
+        </w:rPr>
+      </w:pPr>
+      <w:r>
+        <w:rPr>
+          <w:lang w:val="en-US"/>
+        </w:rPr>
+        <w:t xml:space="preserve">                  -</w:t>
+      </w:r>
+      <w:proofErr w:type="spellStart"/>
+      <w:r>
+        <w:rPr>
+          <w:lang w:val="en-US"/>
+        </w:rPr>
+        <w:t>Dsonar.projectKey</w:t>
+      </w:r>
+      <w:proofErr w:type="spellEnd"/>
+      <w:r>
+        <w:rPr>
+          <w:lang w:val="en-US"/>
+        </w:rPr>
+        <w:t>=</w:t>
+      </w:r>
+      <w:proofErr w:type="spellStart"/>
+      <w:r>
+        <w:rPr>
+          <w:lang w:val="en-US"/>
+        </w:rPr>
+        <w:t>Sonar_Python</w:t>
+      </w:r>
+      <w:proofErr w:type="spellEnd"/>
+      <w:r>
+        <w:rPr>
+          <w:lang w:val="en-US"/>
+        </w:rPr>
+        <w:t>\</w:t>
+      </w:r>
+    </w:p>
+    <w:p>
+      <w:pPr>
+        <w:rPr>
+          <w:lang w:val="en-US"/>
+        </w:rPr>
+      </w:pPr>
+      <w:r>
+        <w:rPr>
+          <w:lang w:val="en-US"/>
+        </w:rPr>
+        <w:lastRenderedPageBreak/>
+        <w:t xml:space="preserve">                  -</w:t>
+      </w:r>
+      <w:proofErr w:type="spellStart"/>
+      <w:r>
+        <w:rPr>
+          <w:lang w:val="en-US"/>
+        </w:rPr>
+        <w:t>Dsonar.sources</w:t>
+      </w:r>
+      <w:proofErr w:type="spellEnd"/>
+      <w:r>
+        <w:rPr>
+          <w:lang w:val="en-US"/>
+        </w:rPr>
+        <w:t>=app \</w:t>
+      </w:r>
+    </w:p>
+    <w:p>
+      <w:pPr>
+        <w:rPr>
+          <w:lang w:val="en-US"/>
+        </w:rPr>
+      </w:pPr>
+      <w:r>
+        <w:rPr>
+          <w:lang w:val="en-US"/>
+        </w:rPr>
+        <w:t xml:space="preserve">                  -</w:t>
+      </w:r>
+      <w:proofErr w:type="spellStart"/>
+      <w:r>
+        <w:rPr>
+          <w:lang w:val="en-US"/>
+        </w:rPr>
+        <w:t>Dsonar.tests</w:t>
+      </w:r>
+      <w:proofErr w:type="spellEnd"/>
+      <w:r>
+        <w:rPr>
+          <w:lang w:val="en-US"/>
+        </w:rPr>
+        <w:t>=test \</w:t>
+      </w:r>
+    </w:p>
+    <w:p>
+      <w:pPr>
+        <w:rPr>
+          <w:lang w:val="en-US"/>
+        </w:rPr>
+      </w:pPr>
+      <w:r>
+        <w:rPr>
+          <w:lang w:val="en-US"/>
+        </w:rPr>
+        <w:t xml:space="preserve">                  -</w:t>
+      </w:r>
+      <w:proofErr w:type="spellStart"/>
+      <w:proofErr w:type="gramStart"/>
+      <w:r>
+        <w:rPr>
+          <w:lang w:val="en-US"/>
+        </w:rPr>
+        <w:t>Dsonar.python.version</w:t>
+      </w:r>
+      <w:proofErr w:type="spellEnd"/>
+      <w:proofErr w:type="gramEnd"/>
+      <w:r>
+        <w:rPr>
+          <w:lang w:val="en-US"/>
+        </w:rPr>
+        <w:t>=3.10 \</w:t>
+      </w:r>
+    </w:p>
+    <w:p>
+      <w:pPr>
+        <w:rPr>
+          <w:lang w:val="en-US"/>
+        </w:rPr>
+      </w:pPr>
+      <w:r>
+        <w:rPr>
+          <w:lang w:val="en-US"/>
+        </w:rPr>
+        <w:t xml:space="preserve">                  -</w:t>
+      </w:r>
+      <w:proofErr w:type="spellStart"/>
+      <w:r>
+        <w:rPr>
+          <w:lang w:val="en-US"/>
+        </w:rPr>
+        <w:t>Dsonar.token</w:t>
+      </w:r>
+      <w:proofErr w:type="spellEnd"/>
+      <w:r>
+        <w:rPr>
+          <w:lang w:val="en-US"/>
+        </w:rPr>
+        <w:t>={NEW_SONAR_TOKEN}</w:t>
+      </w:r>
+    </w:p>
+    <w:p>
+      <w:pPr>
+        <w:rPr>
+          <w:lang w:val="en-US"/>
+        </w:rPr>
+      </w:pPr>
+      <w:r>
+        <w:rPr>
+          <w:lang w:val="en-US"/>
+        </w:rPr>
+        <w:t xml:space="preserve">                  '''</w:t>
+      </w:r>
+    </w:p>
+    <w:p>
+      <w:pPr>
+        <w:rPr>
+          <w:lang w:val="en-US"/>
+        </w:rPr>
+      </w:pPr>
+      <w:r>
+        <w:rPr>
+          <w:lang w:val="en-US"/>
+        </w:rPr>
+        <w:t xml:space="preserve">              }</w:t>
+      </w:r>
+    </w:p>
+    <w:p>
+      <w:pPr>
+        <w:rPr>
+          <w:lang w:val="en-US"/>
+        </w:rPr>
+      </w:pPr>
+      <w:r>
+        <w:rPr>
+          <w:lang w:val="en-US"/>
+        </w:rPr>
+        <w:t xml:space="preserve">          }   </w:t>
+      </w:r>
+    </w:p>
+    <w:p>
+      <w:pPr>
+        <w:rPr>
+          <w:lang w:val="en-US"/>
+        </w:rPr>
+      </w:pPr>
+      <w:r>
+        <w:rPr>
+          <w:lang w:val="en-US"/>
+        </w:rPr>
+        <w:t xml:space="preserve">        }</w:t>
+      </w:r>
+    </w:p>
+    <w:p>
+      <w:pPr>
+        <w:rPr>
+          <w:lang w:val="en-US"/>
+        </w:rPr>
+      </w:pPr>
+      <w:r>
+        <w:rPr>
+          <w:lang w:val="en-US"/>
+        </w:rPr>
+        <w:t xml:space="preserve">    }</w:t>
+      </w:r>
+    </w:p>
+    <w:p>
+      <w:pPr>
+        <w:rPr>
+          <w:lang w:val="en-US"/>
+        </w:rPr>
+      </w:pPr>
+      <w:r>
+        <w:rPr>
+          <w:lang w:val="en-US"/>
+        </w:rPr>
+        <w:t>}</w:t>
+      </w:r>
+    </w:p>
+    <w:p>
+      <w:pPr>
+        <w:rPr>
+          <w:lang w:val="en-US"/>
+        </w:rPr>
+      </w:pPr>
+    </w:p>
+    <w:p>
+      <w:pPr>
+        <w:pStyle w:val="Heading1"/>
+        <w:jc w:val="center"/>
+      </w:pPr>
+      <w:r>
+        <w:t>Add POST ACTIONS:</w:t>
+      </w:r>
+    </w:p>
+    <w:p>
+      <w:pPr>
+        <w:rPr>
+          <w:lang w:val="en-US"/>
+        </w:rPr>
+      </w:pPr>
+      <w:r>
+        <w:rPr>
+          <w:lang w:val="en-US"/>
+        </w:rPr>
+        <w:t>pipeline {</w:t>
+      </w:r>
+    </w:p>
+    <w:p>
+      <w:pPr>
+        <w:rPr>
+          <w:lang w:val="en-US"/>
+        </w:rPr>
+      </w:pPr>
+      <w:r>
+        <w:rPr>
+          <w:lang w:val="en-US"/>
+        </w:rPr>
+        <w:t xml:space="preserve">    agent any</w:t>
+      </w:r>
+    </w:p>
+    <w:p>
+      <w:pPr>
+        <w:rPr>
+          <w:lang w:val="en-US"/>
+        </w:rPr>
+      </w:pPr>
+      <w:r>
+        <w:rPr>
+          <w:lang w:val="en-US"/>
+        </w:rPr>
+        <w:t xml:space="preserve">    </w:t>
+      </w:r>
+      <w:proofErr w:type="gramStart"/>
+      <w:r>
+        <w:rPr>
+          <w:lang w:val="en-US"/>
+        </w:rPr>
+        <w:t>environment{</w:t>
+      </w:r>
+      <w:proofErr w:type="gramEnd"/>
+    </w:p>
+    <w:p>
+      <w:pPr>
+        <w:rPr>
+          <w:lang w:val="en-US"/>
+        </w:rPr>
+      </w:pPr>
+      <w:r>
+        <w:rPr>
+          <w:lang w:val="en-US"/>
+        </w:rPr>
+        <w:t xml:space="preserve">        SONARQUBE_ENV='</w:t>
+      </w:r>
+      <w:proofErr w:type="spellStart"/>
+      <w:r>
+        <w:rPr>
+          <w:lang w:val="en-US"/>
+        </w:rPr>
+        <w:t>MySonar</w:t>
+      </w:r>
+      <w:proofErr w:type="spellEnd"/>
+      <w:r>
+        <w:rPr>
+          <w:lang w:val="en-US"/>
+        </w:rPr>
+        <w:t>' //</w:t>
+      </w:r>
+      <w:proofErr w:type="spellStart"/>
+      <w:r>
+        <w:rPr>
+          <w:lang w:val="en-US"/>
+        </w:rPr>
+        <w:t>jenkis</w:t>
+      </w:r>
+      <w:proofErr w:type="spellEnd"/>
+      <w:r>
+        <w:rPr>
+          <w:lang w:val="en-US"/>
+        </w:rPr>
+        <w:t>-&gt;</w:t>
+      </w:r>
+      <w:proofErr w:type="spellStart"/>
+      <w:r>
+        <w:rPr>
+          <w:lang w:val="en-US"/>
+        </w:rPr>
+        <w:t>managejenkins</w:t>
+      </w:r>
+      <w:proofErr w:type="spellEnd"/>
+      <w:r>
+        <w:rPr>
+          <w:lang w:val="en-US"/>
+        </w:rPr>
+        <w:t>-&gt;configure system</w:t>
+      </w:r>
+    </w:p>
+    <w:p>
+      <w:pPr>
+        <w:rPr>
+          <w:lang w:val="en-US"/>
+        </w:rPr>
+      </w:pPr>
+      <w:r>
+        <w:rPr>
+          <w:lang w:val="en-US"/>
+        </w:rPr>
+        <w:t xml:space="preserve">        SONAR_TOKEN=credentials('NEW_SONAR_TOKEN') //from-&gt; </w:t>
+      </w:r>
+      <w:proofErr w:type="spellStart"/>
+      <w:r>
+        <w:rPr>
+          <w:lang w:val="en-US"/>
+        </w:rPr>
+        <w:t>jenkins</w:t>
+      </w:r>
+      <w:proofErr w:type="spellEnd"/>
+      <w:r>
+        <w:rPr>
+          <w:lang w:val="en-US"/>
+        </w:rPr>
+        <w:t xml:space="preserve"> credentials</w:t>
+      </w:r>
+    </w:p>
+    <w:p>
+      <w:pPr>
+        <w:rPr>
+          <w:lang w:val="en-US"/>
+        </w:rPr>
+      </w:pPr>
+      <w:r>
+        <w:rPr>
+          <w:lang w:val="en-US"/>
+        </w:rPr>
+        <w:t xml:space="preserve">    }</w:t>
+      </w:r>
+    </w:p>
+    <w:p>
+      <w:pPr>
+        <w:rPr>
+          <w:lang w:val="en-US"/>
+        </w:rPr>
+      </w:pPr>
+    </w:p>
+    <w:p>
+      <w:pPr>
+        <w:rPr>
+          <w:lang w:val="en-US"/>
+        </w:rPr>
+      </w:pPr>
+      <w:r>
+        <w:rPr>
+          <w:lang w:val="en-US"/>
+        </w:rPr>
+        <w:t xml:space="preserve">    stages {</w:t>
+      </w:r>
+    </w:p>
+    <w:p>
+      <w:pPr>
+        <w:rPr>
+          <w:lang w:val="en-US"/>
+        </w:rPr>
+      </w:pPr>
+      <w:r>
+        <w:rPr>
+          <w:lang w:val="en-US"/>
+        </w:rPr>
+        <w:t xml:space="preserve">        stage('checkout') {</w:t>
+      </w:r>
+    </w:p>
+    <w:p>
+      <w:pPr>
+        <w:rPr>
+          <w:lang w:val="en-US"/>
+        </w:rPr>
+      </w:pPr>
+      <w:r>
+        <w:rPr>
+          <w:lang w:val="en-US"/>
+        </w:rPr>
+        <w:t xml:space="preserve">            steps {</w:t>
+      </w:r>
+    </w:p>
+    <w:p>
+      <w:pPr>
+        <w:rPr>
+          <w:lang w:val="en-US"/>
+        </w:rPr>
+      </w:pPr>
+      <w:r>
+        <w:rPr>
+          <w:lang w:val="en-US"/>
+        </w:rPr>
+        <w:t xml:space="preserve">                </w:t>
+      </w:r>
+      <w:proofErr w:type="spellStart"/>
+      <w:r>
+        <w:rPr>
+          <w:lang w:val="en-US"/>
+        </w:rPr>
+        <w:t>git</w:t>
+      </w:r>
+      <w:proofErr w:type="spellEnd"/>
+      <w:r>
+        <w:rPr>
+          <w:lang w:val="en-US"/>
+        </w:rPr>
+        <w:t xml:space="preserve"> url:'https://github.com/Nikunj-Java/Sonar_Python.git</w:t>
+      </w:r>
+      <w:proofErr w:type="gramStart"/>
+      <w:r>
+        <w:rPr>
+          <w:lang w:val="en-US"/>
+        </w:rPr>
+        <w:t>',branch</w:t>
+      </w:r>
+      <w:proofErr w:type="gramEnd"/>
+      <w:r>
+        <w:rPr>
+          <w:lang w:val="en-US"/>
+        </w:rPr>
+        <w:t>:'main'</w:t>
+      </w:r>
+    </w:p>
+    <w:p>
+      <w:pPr>
+        <w:rPr>
+          <w:lang w:val="en-US"/>
+        </w:rPr>
+      </w:pPr>
+      <w:r>
+        <w:rPr>
+          <w:lang w:val="en-US"/>
+        </w:rPr>
+        <w:t xml:space="preserve">            }</w:t>
+      </w:r>
+    </w:p>
+    <w:p>
+      <w:pPr>
+        <w:rPr>
+          <w:lang w:val="en-US"/>
+        </w:rPr>
+      </w:pPr>
+      <w:r>
+        <w:rPr>
+          <w:lang w:val="en-US"/>
+        </w:rPr>
+        <w:t xml:space="preserve">        }</w:t>
+      </w:r>
+    </w:p>
+    <w:p>
+      <w:pPr>
+        <w:rPr>
+          <w:lang w:val="en-US"/>
+        </w:rPr>
+      </w:pPr>
+      <w:r>
+        <w:rPr>
+          <w:lang w:val="en-US"/>
+        </w:rPr>
+        <w:t xml:space="preserve">        </w:t>
+      </w:r>
+      <w:proofErr w:type="gramStart"/>
+      <w:r>
+        <w:rPr>
+          <w:lang w:val="en-US"/>
+        </w:rPr>
+        <w:t>stage(</w:t>
+      </w:r>
+      <w:proofErr w:type="gramEnd"/>
+      <w:r>
+        <w:rPr>
+          <w:lang w:val="en-US"/>
+        </w:rPr>
+        <w:t>'Email Approval'){</w:t>
+      </w:r>
+    </w:p>
+    <w:p>
+      <w:pPr>
+        <w:rPr>
+          <w:lang w:val="en-US"/>
+        </w:rPr>
+      </w:pPr>
+      <w:r>
+        <w:rPr>
+          <w:lang w:val="en-US"/>
+        </w:rPr>
+        <w:t xml:space="preserve">            </w:t>
+      </w:r>
+      <w:proofErr w:type="gramStart"/>
+      <w:r>
+        <w:rPr>
+          <w:lang w:val="en-US"/>
+        </w:rPr>
+        <w:t>steps{</w:t>
+      </w:r>
+      <w:proofErr w:type="gramEnd"/>
+    </w:p>
+    <w:p>
+      <w:pPr>
+        <w:rPr>
+          <w:lang w:val="en-US"/>
+        </w:rPr>
+      </w:pPr>
+      <w:r>
+        <w:rPr>
+          <w:lang w:val="en-US"/>
+        </w:rPr>
+        <w:t xml:space="preserve">                mail to:'ganitniduniyanikunj10@gmail.com',</w:t>
+      </w:r>
+    </w:p>
+    <w:p>
+      <w:pPr>
+        <w:rPr>
+          <w:lang w:val="en-US"/>
+        </w:rPr>
+      </w:pPr>
+      <w:r>
+        <w:rPr>
+          <w:lang w:val="en-US"/>
+        </w:rPr>
+        <w:t xml:space="preserve">                </w:t>
+      </w:r>
+      <w:proofErr w:type="spellStart"/>
+      <w:r>
+        <w:rPr>
+          <w:lang w:val="en-US"/>
+        </w:rPr>
+        <w:t>subject:'Approval</w:t>
+      </w:r>
+      <w:proofErr w:type="spellEnd"/>
+      <w:r>
+        <w:rPr>
+          <w:lang w:val="en-US"/>
+        </w:rPr>
+        <w:t xml:space="preserve"> Needed for Production Deployment',</w:t>
+      </w:r>
+    </w:p>
+    <w:p>
+      <w:pPr>
+        <w:rPr>
+          <w:lang w:val="en-US"/>
+        </w:rPr>
+      </w:pPr>
+      <w:r>
+        <w:rPr>
+          <w:lang w:val="en-US"/>
+        </w:rPr>
+        <w:t xml:space="preserve">                body:"""\</w:t>
+      </w:r>
+    </w:p>
+    <w:p>
+      <w:pPr>
+        <w:rPr>
+          <w:lang w:val="en-US"/>
+        </w:rPr>
+      </w:pPr>
+      <w:r>
+        <w:rPr>
+          <w:lang w:val="en-US"/>
+        </w:rPr>
+        <w:t xml:space="preserve">                Build #${</w:t>
+      </w:r>
+      <w:proofErr w:type="spellStart"/>
+      <w:proofErr w:type="gramStart"/>
+      <w:r>
+        <w:rPr>
+          <w:lang w:val="en-US"/>
+        </w:rPr>
+        <w:t>env.BUILD</w:t>
+      </w:r>
+      <w:proofErr w:type="gramEnd"/>
+      <w:r>
+        <w:rPr>
+          <w:lang w:val="en-US"/>
+        </w:rPr>
+        <w:t>_NUMBER</w:t>
+      </w:r>
+      <w:proofErr w:type="spellEnd"/>
+      <w:r>
+        <w:rPr>
+          <w:lang w:val="en-US"/>
+        </w:rPr>
+        <w:t>} is ready for Production Kindly Approve.</w:t>
+      </w:r>
+    </w:p>
+    <w:p>
+      <w:pPr>
+        <w:rPr>
+          <w:lang w:val="en-US"/>
+        </w:rPr>
+      </w:pPr>
+      <w:r>
+        <w:rPr>
+          <w:lang w:val="en-US"/>
+        </w:rPr>
+        <w:lastRenderedPageBreak/>
+        <w:t xml:space="preserve">                </w:t>
+      </w:r>
+    </w:p>
+    <w:p>
+      <w:pPr>
+        <w:rPr>
+          <w:lang w:val="en-US"/>
+        </w:rPr>
+      </w:pPr>
+      <w:r>
+        <w:rPr>
+          <w:lang w:val="en-US"/>
+        </w:rPr>
+        <w:t xml:space="preserve">                click the following link to approve:</w:t>
+      </w:r>
+    </w:p>
+    <w:p>
+      <w:pPr>
+        <w:rPr>
+          <w:lang w:val="en-US"/>
+        </w:rPr>
+      </w:pPr>
+      <w:r>
+        <w:rPr>
+          <w:lang w:val="en-US"/>
+        </w:rPr>
+        <w:t xml:space="preserve">                ${</w:t>
+      </w:r>
+      <w:proofErr w:type="spellStart"/>
+      <w:proofErr w:type="gramStart"/>
+      <w:r>
+        <w:rPr>
+          <w:lang w:val="en-US"/>
+        </w:rPr>
+        <w:t>env.BUILD</w:t>
+      </w:r>
+      <w:proofErr w:type="gramEnd"/>
+      <w:r>
+        <w:rPr>
+          <w:lang w:val="en-US"/>
+        </w:rPr>
+        <w:t>_URL</w:t>
+      </w:r>
+      <w:proofErr w:type="spellEnd"/>
+      <w:r>
+        <w:rPr>
+          <w:lang w:val="en-US"/>
+        </w:rPr>
+        <w:t>}</w:t>
+      </w:r>
+    </w:p>
+    <w:p>
+      <w:pPr>
+        <w:rPr>
+          <w:lang w:val="en-US"/>
+        </w:rPr>
+      </w:pPr>
+      <w:r>
+        <w:rPr>
+          <w:lang w:val="en-US"/>
+        </w:rPr>
+        <w:t xml:space="preserve">                </w:t>
+      </w:r>
+    </w:p>
+    <w:p>
+      <w:pPr>
+        <w:rPr>
+          <w:lang w:val="en-US"/>
+        </w:rPr>
+      </w:pPr>
+      <w:r>
+        <w:rPr>
+          <w:lang w:val="en-US"/>
+        </w:rPr>
+        <w:t xml:space="preserve">                login and click "Proceed" in the "Approval" Stage</w:t>
+      </w:r>
+    </w:p>
+    <w:p>
+      <w:pPr>
+        <w:rPr>
+          <w:lang w:val="en-US"/>
+        </w:rPr>
+      </w:pPr>
+      <w:r>
+        <w:rPr>
+          <w:lang w:val="en-US"/>
+        </w:rPr>
+        <w:t xml:space="preserve">                """</w:t>
+      </w:r>
+    </w:p>
+    <w:p>
+      <w:pPr>
+        <w:rPr>
+          <w:lang w:val="en-US"/>
+        </w:rPr>
+      </w:pPr>
+      <w:r>
+        <w:rPr>
+          <w:lang w:val="en-US"/>
+        </w:rPr>
+        <w:t xml:space="preserve">            }</w:t>
+      </w:r>
+    </w:p>
+    <w:p>
+      <w:pPr>
+        <w:rPr>
+          <w:lang w:val="en-US"/>
+        </w:rPr>
+      </w:pPr>
+      <w:r>
+        <w:rPr>
+          <w:lang w:val="en-US"/>
+        </w:rPr>
+        <w:t xml:space="preserve">        }</w:t>
+      </w:r>
+    </w:p>
+    <w:p>
+      <w:pPr>
+        <w:rPr>
+          <w:lang w:val="en-US"/>
+        </w:rPr>
+      </w:pPr>
+      <w:r>
+        <w:rPr>
+          <w:lang w:val="en-US"/>
+        </w:rPr>
+        <w:t xml:space="preserve">        </w:t>
+      </w:r>
+      <w:proofErr w:type="gramStart"/>
+      <w:r>
+        <w:rPr>
+          <w:lang w:val="en-US"/>
+        </w:rPr>
+        <w:t>stage(</w:t>
+      </w:r>
+      <w:proofErr w:type="gramEnd"/>
+      <w:r>
+        <w:rPr>
+          <w:lang w:val="en-US"/>
+        </w:rPr>
+        <w:t>'Approval Before Sonar Analysis'){</w:t>
+      </w:r>
+    </w:p>
+    <w:p>
+      <w:pPr>
+        <w:rPr>
+          <w:lang w:val="en-US"/>
+        </w:rPr>
+      </w:pPr>
+      <w:r>
+        <w:rPr>
+          <w:lang w:val="en-US"/>
+        </w:rPr>
+        <w:t xml:space="preserve">            </w:t>
+      </w:r>
+      <w:proofErr w:type="gramStart"/>
+      <w:r>
+        <w:rPr>
+          <w:lang w:val="en-US"/>
+        </w:rPr>
+        <w:t>steps{</w:t>
+      </w:r>
+      <w:proofErr w:type="gramEnd"/>
+    </w:p>
+    <w:p>
+      <w:pPr>
+        <w:rPr>
+          <w:lang w:val="en-US"/>
+        </w:rPr>
+      </w:pPr>
+      <w:r>
+        <w:rPr>
+          <w:lang w:val="en-US"/>
+        </w:rPr>
+        <w:t xml:space="preserve">                timeout(time:</w:t>
+      </w:r>
+      <w:proofErr w:type="gramStart"/>
+      <w:r>
+        <w:rPr>
+          <w:lang w:val="en-US"/>
+        </w:rPr>
+        <w:t>10,unit</w:t>
+      </w:r>
+      <w:proofErr w:type="gramEnd"/>
+      <w:r>
+        <w:rPr>
+          <w:lang w:val="en-US"/>
+        </w:rPr>
+        <w:t>:'MINUTES'){</w:t>
+      </w:r>
+    </w:p>
+    <w:p>
+      <w:pPr>
+        <w:rPr>
+          <w:lang w:val="en-US"/>
+        </w:rPr>
+      </w:pPr>
+      <w:r>
+        <w:rPr>
+          <w:lang w:val="en-US"/>
+        </w:rPr>
+        <w:t xml:space="preserve">                    input message: 'Approve to run </w:t>
+      </w:r>
+      <w:proofErr w:type="spellStart"/>
+      <w:r>
+        <w:rPr>
+          <w:lang w:val="en-US"/>
+        </w:rPr>
+        <w:t>SonarQube</w:t>
+      </w:r>
+      <w:proofErr w:type="spellEnd"/>
+      <w:r>
+        <w:rPr>
+          <w:lang w:val="en-US"/>
+        </w:rPr>
+        <w:t xml:space="preserve"> Analysis? </w:t>
+      </w:r>
+      <w:proofErr w:type="gramStart"/>
+      <w:r>
+        <w:rPr>
+          <w:lang w:val="en-US"/>
+        </w:rPr>
+        <w:t>',</w:t>
+      </w:r>
+      <w:proofErr w:type="spellStart"/>
+      <w:r>
+        <w:rPr>
+          <w:lang w:val="en-US"/>
+        </w:rPr>
+        <w:t>ok</w:t>
+      </w:r>
+      <w:proofErr w:type="gramEnd"/>
+      <w:r>
+        <w:rPr>
+          <w:lang w:val="en-US"/>
+        </w:rPr>
+        <w:t>:'Run</w:t>
+      </w:r>
+      <w:proofErr w:type="spellEnd"/>
+      <w:r>
+        <w:rPr>
+          <w:lang w:val="en-US"/>
+        </w:rPr>
+        <w:t xml:space="preserve"> Analysis'</w:t>
+      </w:r>
+    </w:p>
+    <w:p>
+      <w:pPr>
+        <w:rPr>
+          <w:lang w:val="en-US"/>
+        </w:rPr>
+      </w:pPr>
+      <w:r>
+        <w:rPr>
+          <w:lang w:val="en-US"/>
+        </w:rPr>
+        <w:t xml:space="preserve">                }</w:t>
+      </w:r>
+    </w:p>
+    <w:p>
+      <w:pPr>
+        <w:rPr>
+          <w:lang w:val="en-US"/>
+        </w:rPr>
+      </w:pPr>
+      <w:r>
+        <w:rPr>
+          <w:lang w:val="en-US"/>
+        </w:rPr>
+        <w:t xml:space="preserve">            }</w:t>
+      </w:r>
+    </w:p>
+    <w:p>
+      <w:pPr>
+        <w:rPr>
+          <w:lang w:val="en-US"/>
+        </w:rPr>
+      </w:pPr>
+      <w:r>
+        <w:rPr>
+          <w:lang w:val="en-US"/>
+        </w:rPr>
+        <w:t xml:space="preserve">        }</w:t>
+      </w:r>
+    </w:p>
+    <w:p>
+      <w:pPr>
+        <w:rPr>
+          <w:lang w:val="en-US"/>
+        </w:rPr>
+      </w:pPr>
+      <w:r>
+        <w:rPr>
+          <w:lang w:val="en-US"/>
+        </w:rPr>
+        <w:t xml:space="preserve">        </w:t>
+      </w:r>
+      <w:proofErr w:type="gramStart"/>
+      <w:r>
+        <w:rPr>
+          <w:lang w:val="en-US"/>
+        </w:rPr>
+        <w:t>stage(</w:t>
+      </w:r>
+      <w:proofErr w:type="gramEnd"/>
+      <w:r>
+        <w:rPr>
+          <w:lang w:val="en-US"/>
+        </w:rPr>
+        <w:t>'</w:t>
+      </w:r>
+      <w:proofErr w:type="spellStart"/>
+      <w:r>
+        <w:rPr>
+          <w:lang w:val="en-US"/>
+        </w:rPr>
+        <w:t>SonarQube</w:t>
+      </w:r>
+      <w:proofErr w:type="spellEnd"/>
+      <w:r>
+        <w:rPr>
+          <w:lang w:val="en-US"/>
+        </w:rPr>
+        <w:t xml:space="preserve"> Analysis'){</w:t>
+      </w:r>
+    </w:p>
+    <w:p>
+      <w:pPr>
+        <w:rPr>
+          <w:lang w:val="en-US"/>
+        </w:rPr>
+      </w:pPr>
+      <w:r>
+        <w:rPr>
+          <w:lang w:val="en-US"/>
+        </w:rPr>
+        <w:t xml:space="preserve">          </w:t>
+      </w:r>
+      <w:proofErr w:type="gramStart"/>
+      <w:r>
+        <w:rPr>
+          <w:lang w:val="en-US"/>
+        </w:rPr>
+        <w:t>steps{</w:t>
+      </w:r>
+      <w:proofErr w:type="gramEnd"/>
+    </w:p>
+    <w:p>
+      <w:pPr>
+        <w:rPr>
+          <w:lang w:val="en-US"/>
+        </w:rPr>
+      </w:pPr>
+      <w:r>
+        <w:rPr>
+          <w:lang w:val="en-US"/>
+        </w:rPr>
+        <w:t xml:space="preserve">              </w:t>
+      </w:r>
+      <w:proofErr w:type="spellStart"/>
+      <w:r>
+        <w:rPr>
+          <w:lang w:val="en-US"/>
+        </w:rPr>
+        <w:t>withSonarQubeEnv</w:t>
+      </w:r>
+      <w:proofErr w:type="spellEnd"/>
+      <w:r>
+        <w:rPr>
+          <w:lang w:val="en-US"/>
+        </w:rPr>
+        <w:t>("${SONARQUBE_ENV}</w:t>
+      </w:r>
+      <w:proofErr w:type="gramStart"/>
+      <w:r>
+        <w:rPr>
+          <w:lang w:val="en-US"/>
+        </w:rPr>
+        <w:t>"){</w:t>
+      </w:r>
+      <w:proofErr w:type="gramEnd"/>
+    </w:p>
+    <w:p>
+      <w:pPr>
+        <w:rPr>
+          <w:lang w:val="en-US"/>
+        </w:rPr>
+      </w:pPr>
+      <w:r>
+        <w:rPr>
+          <w:lang w:val="en-US"/>
+        </w:rPr>
+        <w:t xml:space="preserve">                  </w:t>
+      </w:r>
+      <w:proofErr w:type="spellStart"/>
+      <w:r>
+        <w:rPr>
+          <w:lang w:val="en-US"/>
+        </w:rPr>
+        <w:t>sh</w:t>
+      </w:r>
+      <w:proofErr w:type="spellEnd"/>
+      <w:r>
+        <w:rPr>
+          <w:lang w:val="en-US"/>
+        </w:rPr>
+        <w:t xml:space="preserve">''' </w:t>
+      </w:r>
+    </w:p>
+    <w:p>
+      <w:pPr>
+        <w:rPr>
+          <w:lang w:val="en-US"/>
+        </w:rPr>
+      </w:pPr>
+      <w:r>
+        <w:rPr>
+          <w:lang w:val="en-US"/>
+        </w:rPr>
+        <w:t xml:space="preserve">                  /opt/sonar-scanner/bin/sonar-scanner\</w:t>
+      </w:r>
+    </w:p>
+    <w:p>
+      <w:pPr>
+        <w:rPr>
+          <w:lang w:val="en-US"/>
+        </w:rPr>
+      </w:pPr>
+      <w:r>
+        <w:rPr>
+          <w:lang w:val="en-US"/>
+        </w:rPr>
+        <w:t xml:space="preserve">                  -</w:t>
+      </w:r>
+      <w:proofErr w:type="spellStart"/>
+      <w:r>
+        <w:rPr>
+          <w:lang w:val="en-US"/>
+        </w:rPr>
+        <w:t>Dsonar.projectKey</w:t>
+      </w:r>
+      <w:proofErr w:type="spellEnd"/>
+      <w:r>
+        <w:rPr>
+          <w:lang w:val="en-US"/>
+        </w:rPr>
+        <w:t>=</w:t>
+      </w:r>
+      <w:proofErr w:type="spellStart"/>
+      <w:r>
+        <w:rPr>
+          <w:lang w:val="en-US"/>
+        </w:rPr>
+        <w:t>Sonar_Python</w:t>
+      </w:r>
+      <w:proofErr w:type="spellEnd"/>
+      <w:r>
+        <w:rPr>
+          <w:lang w:val="en-US"/>
+        </w:rPr>
+        <w:t>\</w:t>
+      </w:r>
+    </w:p>
+    <w:p>
+      <w:pPr>
+        <w:rPr>
+          <w:lang w:val="en-US"/>
+        </w:rPr>
+      </w:pPr>
+      <w:r>
+        <w:rPr>
+          <w:lang w:val="en-US"/>
+        </w:rPr>
+        <w:t xml:space="preserve">                  -</w:t>
+      </w:r>
+      <w:proofErr w:type="spellStart"/>
+      <w:r>
+        <w:rPr>
+          <w:lang w:val="en-US"/>
+        </w:rPr>
+        <w:t>Dsonar.sources</w:t>
+      </w:r>
+      <w:proofErr w:type="spellEnd"/>
+      <w:r>
+        <w:rPr>
+          <w:lang w:val="en-US"/>
+        </w:rPr>
+        <w:t>=app \</w:t>
+      </w:r>
+    </w:p>
+    <w:p>
+      <w:pPr>
+        <w:rPr>
+          <w:lang w:val="en-US"/>
+        </w:rPr>
+      </w:pPr>
+      <w:r>
+        <w:rPr>
+          <w:lang w:val="en-US"/>
+        </w:rPr>
+        <w:t xml:space="preserve">                  -</w:t>
+      </w:r>
+      <w:proofErr w:type="spellStart"/>
+      <w:r>
+        <w:rPr>
+          <w:lang w:val="en-US"/>
+        </w:rPr>
+        <w:t>Dsonar.tests</w:t>
+      </w:r>
+      <w:proofErr w:type="spellEnd"/>
+      <w:r>
+        <w:rPr>
+          <w:lang w:val="en-US"/>
+        </w:rPr>
+        <w:t>=test \</w:t>
+      </w:r>
+    </w:p>
+    <w:p>
+      <w:pPr>
+        <w:rPr>
+          <w:lang w:val="en-US"/>
+        </w:rPr>
+      </w:pPr>
+      <w:r>
+        <w:rPr>
+          <w:lang w:val="en-US"/>
+        </w:rPr>
+        <w:t xml:space="preserve">                  -</w:t>
+      </w:r>
+      <w:proofErr w:type="spellStart"/>
+      <w:proofErr w:type="gramStart"/>
+      <w:r>
+        <w:rPr>
+          <w:lang w:val="en-US"/>
+        </w:rPr>
+        <w:t>Dsonar.python.version</w:t>
+      </w:r>
+      <w:proofErr w:type="spellEnd"/>
+      <w:proofErr w:type="gramEnd"/>
+      <w:r>
+        <w:rPr>
+          <w:lang w:val="en-US"/>
+        </w:rPr>
+        <w:t>=3.10 \</w:t>
+      </w:r>
+    </w:p>
+    <w:p>
+      <w:pPr>
+        <w:rPr>
+          <w:lang w:val="en-US"/>
+        </w:rPr>
+      </w:pPr>
+      <w:r>
+        <w:rPr>
+          <w:lang w:val="en-US"/>
+        </w:rPr>
+        <w:t xml:space="preserve">                  -</w:t>
+      </w:r>
+      <w:proofErr w:type="spellStart"/>
+      <w:r>
+        <w:rPr>
+          <w:lang w:val="en-US"/>
+        </w:rPr>
+        <w:t>Dsonar.token</w:t>
+      </w:r>
+      <w:proofErr w:type="spellEnd"/>
+      <w:r>
+        <w:rPr>
+          <w:lang w:val="en-US"/>
+        </w:rPr>
+        <w:t>={NEW_SONAR_TOKEN}</w:t>
+      </w:r>
+    </w:p>
+    <w:p>
+      <w:pPr>
+        <w:rPr>
+          <w:lang w:val="en-US"/>
+        </w:rPr>
+      </w:pPr>
+      <w:r>
+        <w:rPr>
+          <w:lang w:val="en-US"/>
+        </w:rPr>
+        <w:t xml:space="preserve">                  '''</w:t>
+      </w:r>
+    </w:p>
+    <w:p>
+      <w:pPr>
+        <w:rPr>
+          <w:lang w:val="en-US"/>
+        </w:rPr>
+      </w:pPr>
+      <w:r>
+        <w:rPr>
+          <w:lang w:val="en-US"/>
+        </w:rPr>
+        <w:t xml:space="preserve">              }</w:t>
+      </w:r>
+    </w:p>
+    <w:p>
+      <w:pPr>
+        <w:rPr>
+          <w:lang w:val="en-US"/>
+        </w:rPr>
+      </w:pPr>
+      <w:r>
+        <w:rPr>
+          <w:lang w:val="en-US"/>
+        </w:rPr>
+        <w:t xml:space="preserve">          }   </w:t>
+      </w:r>
+    </w:p>
+    <w:p>
+      <w:pPr>
+        <w:rPr>
+          <w:lang w:val="en-US"/>
+        </w:rPr>
+      </w:pPr>
+      <w:r>
+        <w:rPr>
+          <w:lang w:val="en-US"/>
+        </w:rPr>
+        <w:t xml:space="preserve">        }</w:t>
+      </w:r>
+    </w:p>
+    <w:p>
+      <w:pPr>
+        <w:rPr>
+          <w:lang w:val="en-US"/>
+        </w:rPr>
+      </w:pPr>
+      <w:r>
+        <w:rPr>
+          <w:lang w:val="en-US"/>
+        </w:rPr>
+        <w:t xml:space="preserve">    }</w:t>
+      </w:r>
+    </w:p>
+    <w:p>
+      <w:pPr>
+        <w:rPr>
+          <w:lang w:val="en-US"/>
+        </w:rPr>
+      </w:pPr>
+      <w:r>
+        <w:rPr>
+          <w:lang w:val="en-US"/>
+        </w:rPr>
+        <w:t xml:space="preserve">    </w:t>
+      </w:r>
+      <w:proofErr w:type="gramStart"/>
+      <w:r>
+        <w:rPr>
+          <w:lang w:val="en-US"/>
+        </w:rPr>
+        <w:t>post{</w:t>
+      </w:r>
+      <w:proofErr w:type="gramEnd"/>
+    </w:p>
+    <w:p>
+      <w:pPr>
+        <w:rPr>
+          <w:lang w:val="en-US"/>
+        </w:rPr>
+      </w:pPr>
+      <w:r>
+        <w:rPr>
+          <w:lang w:val="en-US"/>
+        </w:rPr>
+        <w:lastRenderedPageBreak/>
+        <w:t xml:space="preserve">        </w:t>
+      </w:r>
+      <w:proofErr w:type="gramStart"/>
+      <w:r>
+        <w:rPr>
+          <w:lang w:val="en-US"/>
+        </w:rPr>
+        <w:t>success{</w:t>
+      </w:r>
+      <w:proofErr w:type="gramEnd"/>
+    </w:p>
+    <w:p>
+      <w:pPr>
+        <w:rPr>
+          <w:lang w:val="en-US"/>
+        </w:rPr>
+      </w:pPr>
+      <w:r>
+        <w:rPr>
+          <w:lang w:val="en-US"/>
+        </w:rPr>
+        <w:t xml:space="preserve">            </w:t>
+      </w:r>
+      <w:proofErr w:type="spellStart"/>
+      <w:proofErr w:type="gramStart"/>
+      <w:r>
+        <w:rPr>
+          <w:lang w:val="en-US"/>
+        </w:rPr>
+        <w:t>emailext</w:t>
+      </w:r>
+      <w:proofErr w:type="spellEnd"/>
+      <w:r>
+        <w:rPr>
+          <w:lang w:val="en-US"/>
+        </w:rPr>
+        <w:t>(</w:t>
+      </w:r>
+      <w:proofErr w:type="gramEnd"/>
+    </w:p>
+    <w:p>
+      <w:pPr>
+        <w:rPr>
+          <w:lang w:val="en-US"/>
+        </w:rPr>
+      </w:pPr>
+      <w:r>
+        <w:rPr>
+          <w:lang w:val="en-US"/>
+        </w:rPr>
+        <w:t xml:space="preserve">                </w:t>
+      </w:r>
+      <w:proofErr w:type="spellStart"/>
+      <w:r>
+        <w:rPr>
+          <w:lang w:val="en-US"/>
+        </w:rPr>
+        <w:t>subject:"</w:t>
+      </w:r>
+      <w:proofErr w:type="gramStart"/>
+      <w:r>
+        <w:rPr>
+          <w:lang w:val="en-US"/>
+        </w:rPr>
+        <w:t>Success</w:t>
+      </w:r>
+      <w:proofErr w:type="spellEnd"/>
+      <w:r>
+        <w:rPr>
+          <w:lang w:val="en-US"/>
+        </w:rPr>
+        <w:t>:$</w:t>
+      </w:r>
+      <w:proofErr w:type="gramEnd"/>
+      <w:r>
+        <w:rPr>
+          <w:lang w:val="en-US"/>
+        </w:rPr>
+        <w:t>{</w:t>
+      </w:r>
+      <w:proofErr w:type="spellStart"/>
+      <w:r>
+        <w:rPr>
+          <w:lang w:val="en-US"/>
+        </w:rPr>
+        <w:t>env.JOB_NAME</w:t>
+      </w:r>
+      <w:proofErr w:type="spellEnd"/>
+      <w:r>
+        <w:rPr>
+          <w:lang w:val="en-US"/>
+        </w:rPr>
+        <w:t>} #${</w:t>
+      </w:r>
+      <w:proofErr w:type="spellStart"/>
+      <w:r>
+        <w:rPr>
+          <w:lang w:val="en-US"/>
+        </w:rPr>
+        <w:t>env.BUILD_NUMBER</w:t>
+      </w:r>
+      <w:proofErr w:type="spellEnd"/>
+      <w:r>
+        <w:rPr>
+          <w:lang w:val="en-US"/>
+        </w:rPr>
+        <w:t>}",</w:t>
+      </w:r>
+    </w:p>
+    <w:p>
+      <w:pPr>
+        <w:rPr>
+          <w:lang w:val="en-US"/>
+        </w:rPr>
+      </w:pPr>
+      <w:r>
+        <w:rPr>
+          <w:lang w:val="en-US"/>
+        </w:rPr>
+        <w:t xml:space="preserve">                body:"""</w:t>
+      </w:r>
+    </w:p>
+    <w:p>
+      <w:pPr>
+        <w:rPr>
+          <w:lang w:val="en-US"/>
+        </w:rPr>
+      </w:pPr>
+      <w:r>
+        <w:rPr>
+          <w:lang w:val="en-US"/>
+        </w:rPr>
+        <w:t xml:space="preserve">                    &lt;p&gt;</w:t>
+      </w:r>
+      <w:proofErr w:type="spellStart"/>
+      <w:r>
+        <w:rPr>
+          <w:lang w:val="en-US"/>
+        </w:rPr>
+        <w:t>Hii</w:t>
+      </w:r>
+      <w:proofErr w:type="spellEnd"/>
+      <w:r>
+        <w:rPr>
+          <w:lang w:val="en-US"/>
+        </w:rPr>
+        <w:t>! DevOps team&lt;/p&gt;</w:t>
+      </w:r>
+    </w:p>
+    <w:p>
+      <w:pPr>
+        <w:rPr>
+          <w:lang w:val="en-US"/>
+        </w:rPr>
+      </w:pPr>
+      <w:r>
+        <w:rPr>
+          <w:lang w:val="en-US"/>
+        </w:rPr>
+        <w:t xml:space="preserve">                    &lt;p&gt;Deployment Succeeded for &lt;b&gt;${</w:t>
+      </w:r>
+      <w:proofErr w:type="spellStart"/>
+      <w:proofErr w:type="gramStart"/>
+      <w:r>
+        <w:rPr>
+          <w:lang w:val="en-US"/>
+        </w:rPr>
+        <w:t>env.BUILD</w:t>
+      </w:r>
+      <w:proofErr w:type="gramEnd"/>
+      <w:r>
+        <w:rPr>
+          <w:lang w:val="en-US"/>
+        </w:rPr>
+        <w:t>_NUMBER</w:t>
+      </w:r>
+      <w:proofErr w:type="spellEnd"/>
+      <w:r>
+        <w:rPr>
+          <w:lang w:val="en-US"/>
+        </w:rPr>
+        <w:t>}&lt;/b&gt;.&lt;/p&gt;</w:t>
+      </w:r>
+    </w:p>
+    <w:p>
+      <w:pPr>
+        <w:rPr>
+          <w:lang w:val="en-US"/>
+        </w:rPr>
+      </w:pPr>
+      <w:r>
+        <w:rPr>
+          <w:lang w:val="en-US"/>
+        </w:rPr>
+        <w:t xml:space="preserve">                    &lt;p&gt;Build: #${</w:t>
+      </w:r>
+      <w:proofErr w:type="spellStart"/>
+      <w:proofErr w:type="gramStart"/>
+      <w:r>
+        <w:rPr>
+          <w:lang w:val="en-US"/>
+        </w:rPr>
+        <w:t>env.BUILD</w:t>
+      </w:r>
+      <w:proofErr w:type="gramEnd"/>
+      <w:r>
+        <w:rPr>
+          <w:lang w:val="en-US"/>
+        </w:rPr>
+        <w:t>_NUMBER</w:t>
+      </w:r>
+      <w:proofErr w:type="spellEnd"/>
+      <w:r>
+        <w:rPr>
+          <w:lang w:val="en-US"/>
+        </w:rPr>
+        <w:t>}&lt;/p&gt;</w:t>
+      </w:r>
+    </w:p>
+    <w:p>
+      <w:pPr>
+        <w:rPr>
+          <w:lang w:val="en-US"/>
+        </w:rPr>
+      </w:pPr>
+      <w:r>
+        <w:rPr>
+          <w:lang w:val="en-US"/>
+        </w:rPr>
+        <w:t xml:space="preserve">                    &lt;p&gt;Jenkins URL: &lt;a </w:t>
+      </w:r>
+      <w:proofErr w:type="spellStart"/>
+      <w:r>
+        <w:rPr>
+          <w:lang w:val="en-US"/>
+        </w:rPr>
+        <w:t>href</w:t>
+      </w:r>
+      <w:proofErr w:type="spellEnd"/>
+      <w:r>
+        <w:rPr>
+          <w:lang w:val="en-US"/>
+        </w:rPr>
+        <w:t>='${</w:t>
+      </w:r>
+      <w:proofErr w:type="spellStart"/>
+      <w:proofErr w:type="gramStart"/>
+      <w:r>
+        <w:rPr>
+          <w:lang w:val="en-US"/>
+        </w:rPr>
+        <w:t>env.BUILD</w:t>
+      </w:r>
+      <w:proofErr w:type="gramEnd"/>
+      <w:r>
+        <w:rPr>
+          <w:lang w:val="en-US"/>
+        </w:rPr>
+        <w:t>_URL</w:t>
+      </w:r>
+      <w:proofErr w:type="spellEnd"/>
+      <w:r>
+        <w:rPr>
+          <w:lang w:val="en-US"/>
+        </w:rPr>
+        <w:t>}'&gt;${</w:t>
+      </w:r>
+      <w:proofErr w:type="spellStart"/>
+      <w:r>
+        <w:rPr>
+          <w:lang w:val="en-US"/>
+        </w:rPr>
+        <w:t>env.BUILD_URL</w:t>
+      </w:r>
+      <w:proofErr w:type="spellEnd"/>
+      <w:r>
+        <w:rPr>
+          <w:lang w:val="en-US"/>
+        </w:rPr>
+        <w:t>}&lt;/a&gt;&lt;/p&gt;</w:t>
+      </w:r>
+    </w:p>
+    <w:p>
+      <w:pPr>
+        <w:rPr>
+          <w:lang w:val="en-US"/>
+        </w:rPr>
+      </w:pPr>
+      <w:r>
+        <w:rPr>
+          <w:lang w:val="en-US"/>
+        </w:rPr>
+        <w:t xml:space="preserve">                    &lt;p&gt; Good </w:t>
+      </w:r>
+      <w:proofErr w:type="gramStart"/>
+      <w:r>
+        <w:rPr>
+          <w:lang w:val="en-US"/>
+        </w:rPr>
+        <w:t>Job!&lt;</w:t>
+      </w:r>
+      <w:proofErr w:type="gramEnd"/>
+      <w:r>
+        <w:rPr>
+          <w:lang w:val="en-US"/>
+        </w:rPr>
+        <w:t>/p&gt; """,</w:t>
+      </w:r>
+    </w:p>
+    <w:p>
+      <w:pPr>
+        <w:rPr>
+          <w:lang w:val="en-US"/>
+        </w:rPr>
+      </w:pPr>
+      <w:r>
+        <w:rPr>
+          <w:lang w:val="en-US"/>
+        </w:rPr>
+        <w:t xml:space="preserve">                to: "extraordinarytechy@gmail.com",</w:t>
+      </w:r>
+    </w:p>
+    <w:p>
+      <w:pPr>
+        <w:rPr>
+          <w:lang w:val="en-US"/>
+        </w:rPr>
+      </w:pPr>
+      <w:r>
+        <w:rPr>
+          <w:lang w:val="en-US"/>
+        </w:rPr>
+        <w:t xml:space="preserve">                </w:t>
+      </w:r>
+      <w:proofErr w:type="spellStart"/>
+      <w:r>
+        <w:rPr>
+          <w:lang w:val="en-US"/>
+        </w:rPr>
+        <w:t>mimeType</w:t>
+      </w:r>
+      <w:proofErr w:type="spellEnd"/>
+      <w:r>
+        <w:rPr>
+          <w:lang w:val="en-US"/>
+        </w:rPr>
+        <w:t>: "text/html"</w:t>
+      </w:r>
+    </w:p>
+    <w:p>
+      <w:pPr>
+        <w:rPr>
+          <w:lang w:val="en-US"/>
+        </w:rPr>
+      </w:pPr>
+      <w:r>
+        <w:rPr>
+          <w:lang w:val="en-US"/>
+        </w:rPr>
+        <w:t xml:space="preserve">                )</w:t>
+      </w:r>
+    </w:p>
+    <w:p>
+      <w:pPr>
+        <w:rPr>
+          <w:lang w:val="en-US"/>
+        </w:rPr>
+      </w:pPr>
+      <w:r>
+        <w:rPr>
+          <w:lang w:val="en-US"/>
+        </w:rPr>
+        <w:t xml:space="preserve">        }</w:t>
+      </w:r>
+    </w:p>
+    <w:p>
+      <w:pPr>
+        <w:rPr>
+          <w:lang w:val="en-US"/>
+        </w:rPr>
+      </w:pPr>
+      <w:r>
+        <w:rPr>
+          <w:lang w:val="en-US"/>
+        </w:rPr>
+        <w:t xml:space="preserve">        </w:t>
+      </w:r>
+      <w:proofErr w:type="gramStart"/>
+      <w:r>
+        <w:rPr>
+          <w:lang w:val="en-US"/>
+        </w:rPr>
+        <w:t>failure{</w:t>
+      </w:r>
+      <w:proofErr w:type="gramEnd"/>
+    </w:p>
+    <w:p>
+      <w:pPr>
+        <w:rPr>
+          <w:lang w:val="en-US"/>
+        </w:rPr>
+      </w:pPr>
+      <w:r>
+        <w:rPr>
+          <w:lang w:val="en-US"/>
+        </w:rPr>
+        <w:t xml:space="preserve">            </w:t>
+      </w:r>
+      <w:proofErr w:type="spellStart"/>
+      <w:proofErr w:type="gramStart"/>
+      <w:r>
+        <w:rPr>
+          <w:lang w:val="en-US"/>
+        </w:rPr>
+        <w:t>emailext</w:t>
+      </w:r>
+      <w:proofErr w:type="spellEnd"/>
+      <w:r>
+        <w:rPr>
+          <w:lang w:val="en-US"/>
+        </w:rPr>
+        <w:t>(</w:t>
+      </w:r>
+      <w:proofErr w:type="gramEnd"/>
+    </w:p>
+    <w:p>
+      <w:pPr>
+        <w:rPr>
+          <w:lang w:val="en-US"/>
+        </w:rPr>
+      </w:pPr>
+      <w:r>
+        <w:rPr>
+          <w:lang w:val="en-US"/>
+        </w:rPr>
+        <w:t xml:space="preserve">                </w:t>
+      </w:r>
+      <w:proofErr w:type="spellStart"/>
+      <w:r>
+        <w:rPr>
+          <w:lang w:val="en-US"/>
+        </w:rPr>
+        <w:t>subject:"</w:t>
+      </w:r>
+      <w:proofErr w:type="gramStart"/>
+      <w:r>
+        <w:rPr>
+          <w:lang w:val="en-US"/>
+        </w:rPr>
+        <w:t>Failure</w:t>
+      </w:r>
+      <w:proofErr w:type="spellEnd"/>
+      <w:r>
+        <w:rPr>
+          <w:lang w:val="en-US"/>
+        </w:rPr>
+        <w:t>:$</w:t>
+      </w:r>
+      <w:proofErr w:type="gramEnd"/>
+      <w:r>
+        <w:rPr>
+          <w:lang w:val="en-US"/>
+        </w:rPr>
+        <w:t>{</w:t>
+      </w:r>
+      <w:proofErr w:type="spellStart"/>
+      <w:r>
+        <w:rPr>
+          <w:lang w:val="en-US"/>
+        </w:rPr>
+        <w:t>env.JOB_NAME</w:t>
+      </w:r>
+      <w:proofErr w:type="spellEnd"/>
+      <w:r>
+        <w:rPr>
+          <w:lang w:val="en-US"/>
+        </w:rPr>
+        <w:t>} #${</w:t>
+      </w:r>
+      <w:proofErr w:type="spellStart"/>
+      <w:r>
+        <w:rPr>
+          <w:lang w:val="en-US"/>
+        </w:rPr>
+        <w:t>env.BUILD_NUMBER</w:t>
+      </w:r>
+      <w:proofErr w:type="spellEnd"/>
+      <w:r>
+        <w:rPr>
+          <w:lang w:val="en-US"/>
+        </w:rPr>
+        <w:t>}",</w:t>
+      </w:r>
+    </w:p>
+    <w:p>
+      <w:pPr>
+        <w:rPr>
+          <w:lang w:val="en-US"/>
+        </w:rPr>
+      </w:pPr>
+      <w:r>
+        <w:rPr>
+          <w:lang w:val="en-US"/>
+        </w:rPr>
+        <w:t xml:space="preserve">                body:"""</w:t>
+      </w:r>
+    </w:p>
+    <w:p>
+      <w:pPr>
+        <w:rPr>
+          <w:lang w:val="en-US"/>
+        </w:rPr>
+      </w:pPr>
+      <w:r>
+        <w:rPr>
+          <w:lang w:val="en-US"/>
+        </w:rPr>
+        <w:t xml:space="preserve">                    &lt;p&gt;</w:t>
+      </w:r>
+      <w:proofErr w:type="spellStart"/>
+      <w:r>
+        <w:rPr>
+          <w:lang w:val="en-US"/>
+        </w:rPr>
+        <w:t>Hii</w:t>
+      </w:r>
+      <w:proofErr w:type="spellEnd"/>
+      <w:r>
+        <w:rPr>
+          <w:lang w:val="en-US"/>
+        </w:rPr>
+        <w:t>! DevOps team&lt;/p&gt;</w:t>
+      </w:r>
+    </w:p>
+    <w:p>
+      <w:pPr>
+        <w:rPr>
+          <w:lang w:val="en-US"/>
+        </w:rPr>
+      </w:pPr>
+      <w:r>
+        <w:rPr>
+          <w:lang w:val="en-US"/>
+        </w:rPr>
+        <w:t xml:space="preserve">                    &lt;p&gt;Deployment failed for &lt;b&gt;${</w:t>
+      </w:r>
+      <w:proofErr w:type="spellStart"/>
+      <w:proofErr w:type="gramStart"/>
+      <w:r>
+        <w:rPr>
+          <w:lang w:val="en-US"/>
+        </w:rPr>
+        <w:t>env.BUILD</w:t>
+      </w:r>
+      <w:proofErr w:type="gramEnd"/>
+      <w:r>
+        <w:rPr>
+          <w:lang w:val="en-US"/>
+        </w:rPr>
+        <w:t>_NUMBER</w:t>
+      </w:r>
+      <w:proofErr w:type="spellEnd"/>
+      <w:r>
+        <w:rPr>
+          <w:lang w:val="en-US"/>
+        </w:rPr>
+        <w:t>}&lt;/b&gt;.&lt;/p&gt;</w:t>
+      </w:r>
+    </w:p>
+    <w:p>
+      <w:pPr>
+        <w:rPr>
+          <w:lang w:val="en-US"/>
+        </w:rPr>
+      </w:pPr>
+      <w:r>
+        <w:rPr>
+          <w:lang w:val="en-US"/>
+        </w:rPr>
+        <w:t xml:space="preserve">                    &lt;p&gt;Build: #${</w:t>
+      </w:r>
+      <w:proofErr w:type="spellStart"/>
+      <w:proofErr w:type="gramStart"/>
+      <w:r>
+        <w:rPr>
+          <w:lang w:val="en-US"/>
+        </w:rPr>
+        <w:t>env.BUILD</w:t>
+      </w:r>
+      <w:proofErr w:type="gramEnd"/>
+      <w:r>
+        <w:rPr>
+          <w:lang w:val="en-US"/>
+        </w:rPr>
+        <w:t>_NUMBER</w:t>
+      </w:r>
+      <w:proofErr w:type="spellEnd"/>
+      <w:r>
+        <w:rPr>
+          <w:lang w:val="en-US"/>
+        </w:rPr>
+        <w:t>}&lt;/p&gt;</w:t>
+      </w:r>
+    </w:p>
+    <w:p>
+      <w:pPr>
+        <w:rPr>
+          <w:lang w:val="en-US"/>
+        </w:rPr>
+      </w:pPr>
+      <w:r>
+        <w:rPr>
+          <w:lang w:val="en-US"/>
+        </w:rPr>
+        <w:t xml:space="preserve">                    &lt;p&gt;Jenkins URL: &lt;a </w:t>
+      </w:r>
+      <w:proofErr w:type="spellStart"/>
+      <w:r>
+        <w:rPr>
+          <w:lang w:val="en-US"/>
+        </w:rPr>
+        <w:t>href</w:t>
+      </w:r>
+      <w:proofErr w:type="spellEnd"/>
+      <w:r>
+        <w:rPr>
+          <w:lang w:val="en-US"/>
+        </w:rPr>
+        <w:t>='${</w:t>
+      </w:r>
+      <w:proofErr w:type="spellStart"/>
+      <w:proofErr w:type="gramStart"/>
+      <w:r>
+        <w:rPr>
+          <w:lang w:val="en-US"/>
+        </w:rPr>
+        <w:t>env.BUILD</w:t>
+      </w:r>
+      <w:proofErr w:type="gramEnd"/>
+      <w:r>
+        <w:rPr>
+          <w:lang w:val="en-US"/>
+        </w:rPr>
+        <w:t>_URL</w:t>
+      </w:r>
+      <w:proofErr w:type="spellEnd"/>
+      <w:r>
+        <w:rPr>
+          <w:lang w:val="en-US"/>
+        </w:rPr>
+        <w:t>}'&gt;${</w:t>
+      </w:r>
+      <w:proofErr w:type="spellStart"/>
+      <w:r>
+        <w:rPr>
+          <w:lang w:val="en-US"/>
+        </w:rPr>
+        <w:t>env.BUILD_URL</w:t>
+      </w:r>
+      <w:proofErr w:type="spellEnd"/>
+      <w:r>
+        <w:rPr>
+          <w:lang w:val="en-US"/>
+        </w:rPr>
+        <w:t>}&lt;/a&gt;&lt;/p&gt;</w:t>
+      </w:r>
+    </w:p>
+    <w:p>
+      <w:pPr>
+        <w:rPr>
+          <w:lang w:val="en-US"/>
+        </w:rPr>
+      </w:pPr>
+      <w:r>
+        <w:rPr>
+          <w:lang w:val="en-US"/>
+        </w:rPr>
+        <w:t xml:space="preserve">                    """,</w:t>
+      </w:r>
+    </w:p>
+    <w:p>
+      <w:pPr>
+        <w:rPr>
+          <w:lang w:val="en-US"/>
+        </w:rPr>
+      </w:pPr>
+      <w:r>
+        <w:rPr>
+          <w:lang w:val="en-US"/>
+        </w:rPr>
+        <w:t xml:space="preserve">                to: "extraordinarytechy@gmail.com",</w:t>
+      </w:r>
+    </w:p>
+    <w:p>
+      <w:pPr>
+        <w:rPr>
+          <w:lang w:val="en-US"/>
+        </w:rPr>
+      </w:pPr>
+      <w:r>
+        <w:rPr>
+          <w:lang w:val="en-US"/>
+        </w:rPr>
+        <w:t xml:space="preserve">                </w:t>
+      </w:r>
+      <w:proofErr w:type="spellStart"/>
+      <w:r>
+        <w:rPr>
+          <w:lang w:val="en-US"/>
+        </w:rPr>
+        <w:t>mimeType</w:t>
+      </w:r>
+      <w:proofErr w:type="spellEnd"/>
+      <w:r>
+        <w:rPr>
+          <w:lang w:val="en-US"/>
+        </w:rPr>
+        <w:t>: "text/html"</w:t>
+      </w:r>
+    </w:p>
+    <w:p>
+      <w:pPr>
+        <w:rPr>
+          <w:lang w:val="en-US"/>
+        </w:rPr>
+      </w:pPr>
+      <w:r>
+        <w:rPr>
+          <w:lang w:val="en-US"/>
+        </w:rPr>
+        <w:t xml:space="preserve">                )</w:t>
+      </w:r>
+    </w:p>
+    <w:p>
+      <w:pPr>
+        <w:rPr>
+          <w:lang w:val="en-US"/>
+        </w:rPr>
+      </w:pPr>
+      <w:r>
+        <w:rPr>
+          <w:lang w:val="en-US"/>
+        </w:rPr>
+        <w:t xml:space="preserve">        }</w:t>
+      </w:r>
+    </w:p>
+    <w:p>
+      <w:pPr>
+        <w:rPr>
+          <w:lang w:val="en-US"/>
+        </w:rPr>
+      </w:pPr>
+      <w:r>
+        <w:rPr>
+          <w:lang w:val="en-US"/>
+        </w:rPr>
+        <w:t xml:space="preserve">        </w:t>
+      </w:r>
+      <w:proofErr w:type="gramStart"/>
+      <w:r>
+        <w:rPr>
+          <w:lang w:val="en-US"/>
+        </w:rPr>
+        <w:t>aborted{</w:t>
+      </w:r>
+      <w:proofErr w:type="gramEnd"/>
+    </w:p>
+    <w:p>
+      <w:pPr>
+        <w:rPr>
+          <w:lang w:val="en-US"/>
+        </w:rPr>
+      </w:pPr>
+      <w:r>
+        <w:rPr>
+          <w:lang w:val="en-US"/>
+        </w:rPr>
+        <w:t xml:space="preserve">            </w:t>
+      </w:r>
+      <w:proofErr w:type="spellStart"/>
+      <w:proofErr w:type="gramStart"/>
+      <w:r>
+        <w:rPr>
+          <w:lang w:val="en-US"/>
+        </w:rPr>
+        <w:t>emailext</w:t>
+      </w:r>
+      <w:proofErr w:type="spellEnd"/>
+      <w:r>
+        <w:rPr>
+          <w:lang w:val="en-US"/>
+        </w:rPr>
+        <w:t>(</w:t>
+      </w:r>
+      <w:proofErr w:type="gramEnd"/>
+    </w:p>
+    <w:p>
+      <w:pPr>
+        <w:rPr>
+          <w:lang w:val="en-US"/>
+        </w:rPr>
+      </w:pPr>
+      <w:r>
+        <w:rPr>
+          <w:lang w:val="en-US"/>
+        </w:rPr>
+        <w:t xml:space="preserve">                </w:t>
+      </w:r>
+      <w:proofErr w:type="spellStart"/>
+      <w:r>
+        <w:rPr>
+          <w:lang w:val="en-US"/>
+        </w:rPr>
+        <w:t>subject:"</w:t>
+      </w:r>
+      <w:proofErr w:type="gramStart"/>
+      <w:r>
+        <w:rPr>
+          <w:lang w:val="en-US"/>
+        </w:rPr>
+        <w:t>Aborted</w:t>
+      </w:r>
+      <w:proofErr w:type="spellEnd"/>
+      <w:r>
+        <w:rPr>
+          <w:lang w:val="en-US"/>
+        </w:rPr>
+        <w:t>:$</w:t>
+      </w:r>
+      <w:proofErr w:type="gramEnd"/>
+      <w:r>
+        <w:rPr>
+          <w:lang w:val="en-US"/>
+        </w:rPr>
+        <w:t>{</w:t>
+      </w:r>
+      <w:proofErr w:type="spellStart"/>
+      <w:r>
+        <w:rPr>
+          <w:lang w:val="en-US"/>
+        </w:rPr>
+        <w:t>env.JOB_NAME</w:t>
+      </w:r>
+      <w:proofErr w:type="spellEnd"/>
+      <w:r>
+        <w:rPr>
+          <w:lang w:val="en-US"/>
+        </w:rPr>
+        <w:t>} #${</w:t>
+      </w:r>
+      <w:proofErr w:type="spellStart"/>
+      <w:r>
+        <w:rPr>
+          <w:lang w:val="en-US"/>
+        </w:rPr>
+        <w:t>env.BUILD_NUMBER</w:t>
+      </w:r>
+      <w:proofErr w:type="spellEnd"/>
+      <w:r>
+        <w:rPr>
+          <w:lang w:val="en-US"/>
+        </w:rPr>
+        <w:t>}",</w:t>
+      </w:r>
+    </w:p>
+    <w:p>
+      <w:pPr>
+        <w:rPr>
+          <w:lang w:val="en-US"/>
+        </w:rPr>
+      </w:pPr>
+      <w:r>
+        <w:rPr>
+          <w:lang w:val="en-US"/>
+        </w:rPr>
+        <w:t xml:space="preserve">                body:"""</w:t>
+      </w:r>
+    </w:p>
+    <w:p>
+      <w:pPr>
+        <w:rPr>
+          <w:lang w:val="en-US"/>
+        </w:rPr>
+      </w:pPr>
+      <w:r>
+        <w:rPr>
+          <w:lang w:val="en-US"/>
+        </w:rPr>
+        <w:t xml:space="preserve">                    &lt;p&gt;</w:t>
+      </w:r>
+      <w:proofErr w:type="spellStart"/>
+      <w:r>
+        <w:rPr>
+          <w:lang w:val="en-US"/>
+        </w:rPr>
+        <w:t>Hii</w:t>
+      </w:r>
+      <w:proofErr w:type="spellEnd"/>
+      <w:r>
+        <w:rPr>
+          <w:lang w:val="en-US"/>
+        </w:rPr>
+        <w:t>! DevOps team&lt;/p&gt;</w:t>
+      </w:r>
+    </w:p>
+    <w:p>
+      <w:pPr>
+        <w:rPr>
+          <w:lang w:val="en-US"/>
+        </w:rPr>
+      </w:pPr>
+      <w:r>
+        <w:rPr>
+          <w:lang w:val="en-US"/>
+        </w:rPr>
+        <w:lastRenderedPageBreak/>
+        <w:t xml:space="preserve">                    &lt;p&gt;Deployment Aborted for &lt;b&gt;${</w:t>
+      </w:r>
+      <w:proofErr w:type="spellStart"/>
+      <w:proofErr w:type="gramStart"/>
+      <w:r>
+        <w:rPr>
+          <w:lang w:val="en-US"/>
+        </w:rPr>
+        <w:t>env.BUILD</w:t>
+      </w:r>
+      <w:proofErr w:type="gramEnd"/>
+      <w:r>
+        <w:rPr>
+          <w:lang w:val="en-US"/>
+        </w:rPr>
+        <w:t>_NUMBER</w:t>
+      </w:r>
+      <w:proofErr w:type="spellEnd"/>
+      <w:r>
+        <w:rPr>
+          <w:lang w:val="en-US"/>
+        </w:rPr>
+        <w:t>}&lt;/b&gt;.&lt;/p&gt;</w:t>
+      </w:r>
+    </w:p>
+    <w:p>
+      <w:pPr>
+        <w:rPr>
+          <w:lang w:val="en-US"/>
+        </w:rPr>
+      </w:pPr>
+      <w:r>
+        <w:rPr>
+          <w:lang w:val="en-US"/>
+        </w:rPr>
+        <w:t xml:space="preserve">                    &lt;p&gt;Build: #${</w:t>
+      </w:r>
+      <w:proofErr w:type="spellStart"/>
+      <w:proofErr w:type="gramStart"/>
+      <w:r>
+        <w:rPr>
+          <w:lang w:val="en-US"/>
+        </w:rPr>
+        <w:t>env.BUILD</w:t>
+      </w:r>
+      <w:proofErr w:type="gramEnd"/>
+      <w:r>
+        <w:rPr>
+          <w:lang w:val="en-US"/>
+        </w:rPr>
+        <w:t>_NUMBER</w:t>
+      </w:r>
+      <w:proofErr w:type="spellEnd"/>
+      <w:r>
+        <w:rPr>
+          <w:lang w:val="en-US"/>
+        </w:rPr>
+        <w:t>}&lt;/p&gt;</w:t>
+      </w:r>
+    </w:p>
+    <w:p>
+      <w:pPr>
+        <w:rPr>
+          <w:lang w:val="en-US"/>
+        </w:rPr>
+      </w:pPr>
+      <w:r>
+        <w:rPr>
+          <w:lang w:val="en-US"/>
+        </w:rPr>
+        <w:t xml:space="preserve">                    &lt;p&gt;Jenkins URL: &lt;a </w:t>
+      </w:r>
+      <w:proofErr w:type="spellStart"/>
+      <w:r>
+        <w:rPr>
+          <w:lang w:val="en-US"/>
+        </w:rPr>
+        <w:t>href</w:t>
+      </w:r>
+      <w:proofErr w:type="spellEnd"/>
+      <w:r>
+        <w:rPr>
+          <w:lang w:val="en-US"/>
+        </w:rPr>
+        <w:t>='${</w:t>
+      </w:r>
+      <w:proofErr w:type="spellStart"/>
+      <w:proofErr w:type="gramStart"/>
+      <w:r>
+        <w:rPr>
+          <w:lang w:val="en-US"/>
+        </w:rPr>
+        <w:t>env.BUILD</w:t>
+      </w:r>
+      <w:proofErr w:type="gramEnd"/>
+      <w:r>
+        <w:rPr>
+          <w:lang w:val="en-US"/>
+        </w:rPr>
+        <w:t>_URL</w:t>
+      </w:r>
+      <w:proofErr w:type="spellEnd"/>
+      <w:r>
+        <w:rPr>
+          <w:lang w:val="en-US"/>
+        </w:rPr>
+        <w:t>}'&gt;${</w:t>
+      </w:r>
+      <w:proofErr w:type="spellStart"/>
+      <w:r>
+        <w:rPr>
+          <w:lang w:val="en-US"/>
+        </w:rPr>
+        <w:t>env.BUILD_URL</w:t>
+      </w:r>
+      <w:proofErr w:type="spellEnd"/>
+      <w:r>
+        <w:rPr>
+          <w:lang w:val="en-US"/>
+        </w:rPr>
+        <w:t>}&lt;/a&gt;&lt;/p&gt;</w:t>
+      </w:r>
+    </w:p>
+    <w:p>
+      <w:pPr>
+        <w:rPr>
+          <w:lang w:val="en-US"/>
+        </w:rPr>
+      </w:pPr>
+      <w:r>
+        <w:rPr>
+          <w:lang w:val="en-US"/>
+        </w:rPr>
+        <w:t xml:space="preserve">                    """,</w:t>
+      </w:r>
+    </w:p>
+    <w:p>
+      <w:pPr>
+        <w:rPr>
+          <w:lang w:val="en-US"/>
+        </w:rPr>
+      </w:pPr>
+      <w:r>
+        <w:rPr>
+          <w:lang w:val="en-US"/>
+        </w:rPr>
+        <w:t xml:space="preserve">                to: "extraordinarytechy@gmail.com",</w:t>
+      </w:r>
+    </w:p>
+    <w:p>
+      <w:pPr>
+        <w:rPr>
+          <w:lang w:val="en-US"/>
+        </w:rPr>
+      </w:pPr>
+      <w:r>
+        <w:rPr>
+          <w:lang w:val="en-US"/>
+        </w:rPr>
+        <w:t xml:space="preserve">                </w:t>
+      </w:r>
+      <w:proofErr w:type="spellStart"/>
+      <w:r>
+        <w:rPr>
+          <w:lang w:val="en-US"/>
+        </w:rPr>
+        <w:t>mimeType</w:t>
+      </w:r>
+      <w:proofErr w:type="spellEnd"/>
+      <w:r>
+        <w:rPr>
+          <w:lang w:val="en-US"/>
+        </w:rPr>
+        <w:t>: "text/html"</w:t>
+      </w:r>
+    </w:p>
+    <w:p>
+      <w:pPr>
+        <w:rPr>
+          <w:lang w:val="en-US"/>
+        </w:rPr>
+      </w:pPr>
+      <w:r>
+        <w:rPr>
+          <w:lang w:val="en-US"/>
+        </w:rPr>
+        <w:t xml:space="preserve">                )</w:t>
+      </w:r>
+    </w:p>
+    <w:p>
+      <w:pPr>
+        <w:rPr>
+          <w:lang w:val="en-US"/>
+        </w:rPr>
+      </w:pPr>
+      <w:r>
+        <w:rPr>
+          <w:lang w:val="en-US"/>
+        </w:rPr>
+        <w:t xml:space="preserve">        }</w:t>
+      </w:r>
+    </w:p>
+    <w:p>
+      <w:pPr>
+        <w:rPr>
+          <w:lang w:val="en-US"/>
+        </w:rPr>
+      </w:pPr>
+      <w:r>
+        <w:rPr>
+          <w:lang w:val="en-US"/>
+        </w:rPr>
+        <w:t xml:space="preserve">    }</w:t>
+      </w:r>
+    </w:p>
+    <w:p>
+      <w:pPr>
+        <w:rPr>
+          <w:lang w:val="en-US"/>
+        </w:rPr>
+      </w:pPr>
+      <w:r>
+        <w:rPr>
+          <w:lang w:val="en-US"/>
+        </w:rPr>
+        <w:t>}</w:t>
+      </w:r>
+    </w:p>
+    <w:p>
+      <w:pPr>
+        <w:rPr>
+          <w:lang w:val="en-US"/>
+        </w:rPr>
+      </w:pPr>
+    </w:p>
+    <w:p>
+      <w:pPr>
+        <w:rPr>
+          <w:lang w:val="en-US"/>
+        </w:rPr>
+      </w:pPr>
       <w:bookmarkStart w:id="0" w:name="_GoBack"/>
       <w:bookmarkEnd w:id="0"/>
-    </w:p>
-    <w:p>
-      <w:pPr>
-        <w:rPr>
-          <w:lang w:val="en-US"/>
-        </w:rPr>
-      </w:pPr>
-      <w:r>
-        <w:rPr>
-          <w:lang w:val="en-US"/>
-        </w:rPr>
-        <w:t xml:space="preserve">        stage('checkout') {</w:t>
-      </w:r>
-    </w:p>
-    <w:p>
-      <w:pPr>
-        <w:rPr>
-          <w:lang w:val="en-US"/>
-        </w:rPr>
-      </w:pPr>
-      <w:r>
-        <w:rPr>
-          <w:lang w:val="en-US"/>
-        </w:rPr>
-        <w:lastRenderedPageBreak/>
-        <w:t xml:space="preserve">            steps {</w:t>
-      </w:r>
-    </w:p>
-    <w:p>
-      <w:pPr>
-        <w:rPr>
-          <w:lang w:val="en-US"/>
-        </w:rPr>
-      </w:pPr>
-      <w:r>
-        <w:rPr>
-          <w:lang w:val="en-US"/>
-        </w:rPr>
-        <w:t xml:space="preserve">                </w:t>
-      </w:r>
-      <w:proofErr w:type="spellStart"/>
-      <w:r>
-        <w:rPr>
-          <w:lang w:val="en-US"/>
-        </w:rPr>
-        <w:t>git</w:t>
-      </w:r>
-      <w:proofErr w:type="spellEnd"/>
-      <w:r>
-        <w:rPr>
-          <w:lang w:val="en-US"/>
-        </w:rPr>
-        <w:t xml:space="preserve"> url:'https://github.com/Nikunj-Java/Sonar_Python.git</w:t>
-      </w:r>
-      <w:proofErr w:type="gramStart"/>
-      <w:r>
-        <w:rPr>
-          <w:lang w:val="en-US"/>
-        </w:rPr>
-        <w:t>',branch</w:t>
-      </w:r>
-      <w:proofErr w:type="gramEnd"/>
-      <w:r>
-        <w:rPr>
-          <w:lang w:val="en-US"/>
-        </w:rPr>
-        <w:t>:'main'</w:t>
-      </w:r>
-    </w:p>
-    <w:p>
-      <w:pPr>
-        <w:rPr>
-          <w:lang w:val="en-US"/>
-        </w:rPr>
-      </w:pPr>
-      <w:r>
-        <w:rPr>
-          <w:lang w:val="en-US"/>
-        </w:rPr>
-        <w:t xml:space="preserve">            }</w:t>
-      </w:r>
-    </w:p>
-    <w:p>
-      <w:pPr>
-        <w:rPr>
-          <w:lang w:val="en-US"/>
-        </w:rPr>
-      </w:pPr>
-      <w:r>
-        <w:rPr>
-          <w:lang w:val="en-US"/>
-        </w:rPr>
-        <w:t xml:space="preserve">        }</w:t>
-      </w:r>
-    </w:p>
-    <w:p>
-      <w:pPr>
-        <w:rPr>
-          <w:lang w:val="en-US"/>
-        </w:rPr>
-      </w:pPr>
-      <w:r>
-        <w:rPr>
-          <w:lang w:val="en-US"/>
-        </w:rPr>
-        <w:t xml:space="preserve">        </w:t>
-      </w:r>
-      <w:proofErr w:type="gramStart"/>
-      <w:r>
-        <w:rPr>
-          <w:lang w:val="en-US"/>
-        </w:rPr>
-        <w:t>stage(</w:t>
-      </w:r>
-      <w:proofErr w:type="gramEnd"/>
-      <w:r>
-        <w:rPr>
-          <w:lang w:val="en-US"/>
-        </w:rPr>
-        <w:t>'Email Approval'){</w:t>
-      </w:r>
-    </w:p>
-    <w:p>
-      <w:pPr>
-        <w:rPr>
-          <w:lang w:val="en-US"/>
-        </w:rPr>
-      </w:pPr>
-      <w:r>
-        <w:rPr>
-          <w:lang w:val="en-US"/>
-        </w:rPr>
-        <w:t xml:space="preserve">            </w:t>
-      </w:r>
-      <w:proofErr w:type="gramStart"/>
-      <w:r>
-        <w:rPr>
-          <w:lang w:val="en-US"/>
-        </w:rPr>
-        <w:t>steps{</w:t>
-      </w:r>
-      <w:proofErr w:type="gramEnd"/>
-    </w:p>
-    <w:p>
-      <w:pPr>
-        <w:rPr>
-          <w:lang w:val="en-US"/>
-        </w:rPr>
-      </w:pPr>
-      <w:r>
-        <w:rPr>
-          <w:lang w:val="en-US"/>
-        </w:rPr>
-        <w:t xml:space="preserve">                mail to:'ganitniduniyanikunj10@gmail.com',</w:t>
-      </w:r>
-    </w:p>
-    <w:p>
-      <w:pPr>
-        <w:rPr>
-          <w:lang w:val="en-US"/>
-        </w:rPr>
-      </w:pPr>
-      <w:r>
-        <w:rPr>
-          <w:lang w:val="en-US"/>
-        </w:rPr>
-        <w:t xml:space="preserve">                </w:t>
-      </w:r>
-      <w:proofErr w:type="spellStart"/>
-      <w:r>
-        <w:rPr>
-          <w:lang w:val="en-US"/>
-        </w:rPr>
-        <w:t>subject:'Approval</w:t>
-      </w:r>
-      <w:proofErr w:type="spellEnd"/>
-      <w:r>
-        <w:rPr>
-          <w:lang w:val="en-US"/>
-        </w:rPr>
-        <w:t xml:space="preserve"> Needed for Production Deployment',</w:t>
-      </w:r>
-    </w:p>
-    <w:p>
-      <w:pPr>
-        <w:rPr>
-          <w:lang w:val="en-US"/>
-        </w:rPr>
-      </w:pPr>
-      <w:r>
-        <w:rPr>
-          <w:lang w:val="en-US"/>
-        </w:rPr>
-        <w:t xml:space="preserve">                body:"""\</w:t>
-      </w:r>
-    </w:p>
-    <w:p>
-      <w:pPr>
-        <w:rPr>
-          <w:lang w:val="en-US"/>
-        </w:rPr>
-      </w:pPr>
-      <w:r>
-        <w:rPr>
-          <w:lang w:val="en-US"/>
-        </w:rPr>
-        <w:t xml:space="preserve">                Build #${</w:t>
-      </w:r>
-      <w:proofErr w:type="spellStart"/>
-      <w:proofErr w:type="gramStart"/>
-      <w:r>
-        <w:rPr>
-          <w:lang w:val="en-US"/>
-        </w:rPr>
-        <w:t>env.BUILD</w:t>
-      </w:r>
-      <w:proofErr w:type="gramEnd"/>
-      <w:r>
-        <w:rPr>
-          <w:lang w:val="en-US"/>
-        </w:rPr>
-        <w:t>_NUMBER</w:t>
-      </w:r>
-      <w:proofErr w:type="spellEnd"/>
-      <w:r>
-        <w:rPr>
-          <w:lang w:val="en-US"/>
-        </w:rPr>
-        <w:t>} is ready for Production Kindly Approve.</w:t>
-      </w:r>
-    </w:p>
-    <w:p>
-      <w:pPr>
-        <w:rPr>
-          <w:lang w:val="en-US"/>
-        </w:rPr>
-      </w:pPr>
-      <w:r>
-        <w:rPr>
-          <w:lang w:val="en-US"/>
-        </w:rPr>
-        <w:t xml:space="preserve">                </w:t>
-      </w:r>
-    </w:p>
-    <w:p>
-      <w:pPr>
-        <w:rPr>
-          <w:lang w:val="en-US"/>
-        </w:rPr>
-      </w:pPr>
-      <w:r>
-        <w:rPr>
-          <w:lang w:val="en-US"/>
-        </w:rPr>
-        <w:t xml:space="preserve">                click the following link to approve:</w:t>
-      </w:r>
-    </w:p>
-    <w:p>
-      <w:pPr>
-        <w:rPr>
-          <w:lang w:val="en-US"/>
-        </w:rPr>
-      </w:pPr>
-      <w:r>
-        <w:rPr>
-          <w:lang w:val="en-US"/>
-        </w:rPr>
-        <w:t xml:space="preserve">                ${</w:t>
-      </w:r>
-      <w:proofErr w:type="spellStart"/>
-      <w:proofErr w:type="gramStart"/>
-      <w:r>
-        <w:rPr>
-          <w:lang w:val="en-US"/>
-        </w:rPr>
-        <w:t>env.BUILD</w:t>
-      </w:r>
-      <w:proofErr w:type="gramEnd"/>
-      <w:r>
-        <w:rPr>
-          <w:lang w:val="en-US"/>
-        </w:rPr>
-        <w:t>_URL</w:t>
-      </w:r>
-      <w:proofErr w:type="spellEnd"/>
-      <w:r>
-        <w:rPr>
-          <w:lang w:val="en-US"/>
-        </w:rPr>
-        <w:t>}</w:t>
-      </w:r>
-    </w:p>
-    <w:p>
-      <w:pPr>
-        <w:rPr>
-          <w:lang w:val="en-US"/>
-        </w:rPr>
-      </w:pPr>
-      <w:r>
-        <w:rPr>
-          <w:lang w:val="en-US"/>
-        </w:rPr>
-        <w:t xml:space="preserve">                </w:t>
-      </w:r>
-    </w:p>
-    <w:p>
-      <w:pPr>
-        <w:rPr>
-          <w:lang w:val="en-US"/>
-        </w:rPr>
-      </w:pPr>
-      <w:r>
-        <w:rPr>
-          <w:lang w:val="en-US"/>
-        </w:rPr>
-        <w:t xml:space="preserve">                login and click "Proceed" in the "Approval" Stage</w:t>
-      </w:r>
-    </w:p>
-    <w:p>
-      <w:pPr>
-        <w:rPr>
-          <w:lang w:val="en-US"/>
-        </w:rPr>
-      </w:pPr>
-      <w:r>
-        <w:rPr>
-          <w:lang w:val="en-US"/>
-        </w:rPr>
-        <w:t xml:space="preserve">                """</w:t>
-      </w:r>
-    </w:p>
-    <w:p>
-      <w:pPr>
-        <w:rPr>
-          <w:lang w:val="en-US"/>
-        </w:rPr>
-      </w:pPr>
-      <w:r>
-        <w:rPr>
-          <w:lang w:val="en-US"/>
-        </w:rPr>
-        <w:t xml:space="preserve">            }</w:t>
-      </w:r>
-    </w:p>
-    <w:p>
-      <w:pPr>
-        <w:rPr>
-          <w:lang w:val="en-US"/>
-        </w:rPr>
-      </w:pPr>
-      <w:r>
-        <w:rPr>
-          <w:lang w:val="en-US"/>
-        </w:rPr>
-        <w:t xml:space="preserve">        }</w:t>
-      </w:r>
-    </w:p>
-    <w:p>
-      <w:pPr>
-        <w:rPr>
-          <w:lang w:val="en-US"/>
-        </w:rPr>
-      </w:pPr>
-      <w:r>
-        <w:rPr>
-          <w:lang w:val="en-US"/>
-        </w:rPr>
-        <w:t xml:space="preserve">        </w:t>
-      </w:r>
-      <w:proofErr w:type="gramStart"/>
-      <w:r>
-        <w:rPr>
-          <w:lang w:val="en-US"/>
-        </w:rPr>
-        <w:t>stage(</w:t>
-      </w:r>
-      <w:proofErr w:type="gramEnd"/>
-      <w:r>
-        <w:rPr>
-          <w:lang w:val="en-US"/>
-        </w:rPr>
-        <w:t>'Approval Before Sonar Analysis'){</w:t>
-      </w:r>
-    </w:p>
-    <w:p>
-      <w:pPr>
-        <w:rPr>
-          <w:lang w:val="en-US"/>
-        </w:rPr>
-      </w:pPr>
-      <w:r>
-        <w:rPr>
-          <w:lang w:val="en-US"/>
-        </w:rPr>
-        <w:t xml:space="preserve">            </w:t>
-      </w:r>
-      <w:proofErr w:type="gramStart"/>
-      <w:r>
-        <w:rPr>
-          <w:lang w:val="en-US"/>
-        </w:rPr>
-        <w:t>steps{</w:t>
-      </w:r>
-      <w:proofErr w:type="gramEnd"/>
-    </w:p>
-    <w:p>
-      <w:pPr>
-        <w:rPr>
-          <w:lang w:val="en-US"/>
-        </w:rPr>
-      </w:pPr>
-      <w:r>
-        <w:rPr>
-          <w:lang w:val="en-US"/>
-        </w:rPr>
-        <w:t xml:space="preserve">                timeout(time:</w:t>
-      </w:r>
-      <w:proofErr w:type="gramStart"/>
-      <w:r>
-        <w:rPr>
-          <w:lang w:val="en-US"/>
-        </w:rPr>
-        <w:t>10,unit</w:t>
-      </w:r>
-      <w:proofErr w:type="gramEnd"/>
-      <w:r>
-        <w:rPr>
-          <w:lang w:val="en-US"/>
-        </w:rPr>
-        <w:t>:'MINUTES'){</w:t>
-      </w:r>
-    </w:p>
-    <w:p>
-      <w:pPr>
-        <w:rPr>
-          <w:lang w:val="en-US"/>
-        </w:rPr>
-      </w:pPr>
-      <w:r>
-        <w:rPr>
-          <w:lang w:val="en-US"/>
-        </w:rPr>
-        <w:t xml:space="preserve">                    input message: 'Approve to run </w:t>
-      </w:r>
-      <w:proofErr w:type="spellStart"/>
-      <w:r>
-        <w:rPr>
-          <w:lang w:val="en-US"/>
-        </w:rPr>
-        <w:t>SonarQube</w:t>
-      </w:r>
-      <w:proofErr w:type="spellEnd"/>
-      <w:r>
-        <w:rPr>
-          <w:lang w:val="en-US"/>
-        </w:rPr>
-        <w:t xml:space="preserve"> Analysis? </w:t>
-      </w:r>
-      <w:proofErr w:type="gramStart"/>
-      <w:r>
-        <w:rPr>
-          <w:lang w:val="en-US"/>
-        </w:rPr>
-        <w:t>',</w:t>
-      </w:r>
-      <w:proofErr w:type="spellStart"/>
-      <w:r>
-        <w:rPr>
-          <w:lang w:val="en-US"/>
-        </w:rPr>
-        <w:t>ok</w:t>
-      </w:r>
-      <w:proofErr w:type="gramEnd"/>
-      <w:r>
-        <w:rPr>
-          <w:lang w:val="en-US"/>
-        </w:rPr>
-        <w:t>:'Run</w:t>
-      </w:r>
-      <w:proofErr w:type="spellEnd"/>
-      <w:r>
-        <w:rPr>
-          <w:lang w:val="en-US"/>
-        </w:rPr>
-        <w:t xml:space="preserve"> Analysis'</w:t>
-      </w:r>
-    </w:p>
-    <w:p>
-      <w:pPr>
-        <w:rPr>
-          <w:lang w:val="en-US"/>
-        </w:rPr>
-      </w:pPr>
-      <w:r>
-        <w:rPr>
-          <w:lang w:val="en-US"/>
-        </w:rPr>
-        <w:t xml:space="preserve">                }</w:t>
-      </w:r>
-    </w:p>
-    <w:p>
-      <w:pPr>
-        <w:rPr>
-          <w:lang w:val="en-US"/>
-        </w:rPr>
-      </w:pPr>
-      <w:r>
-        <w:rPr>
-          <w:lang w:val="en-US"/>
-        </w:rPr>
-        <w:t xml:space="preserve">            }</w:t>
-      </w:r>
-    </w:p>
-    <w:p>
-      <w:pPr>
-        <w:rPr>
-          <w:lang w:val="en-US"/>
-        </w:rPr>
-      </w:pPr>
-      <w:r>
-        <w:rPr>
-          <w:lang w:val="en-US"/>
-        </w:rPr>
-        <w:t xml:space="preserve">        }</w:t>
-      </w:r>
-    </w:p>
-    <w:p>
-      <w:pPr>
-        <w:rPr>
-          <w:lang w:val="en-US"/>
-        </w:rPr>
-      </w:pPr>
-      <w:r>
-        <w:rPr>
-          <w:lang w:val="en-US"/>
-        </w:rPr>
-        <w:t xml:space="preserve">        </w:t>
-      </w:r>
-      <w:proofErr w:type="gramStart"/>
-      <w:r>
-        <w:rPr>
-          <w:lang w:val="en-US"/>
-        </w:rPr>
-        <w:t>stage(</w:t>
-      </w:r>
-      <w:proofErr w:type="gramEnd"/>
-      <w:r>
-        <w:rPr>
-          <w:lang w:val="en-US"/>
-        </w:rPr>
-        <w:t>'</w:t>
-      </w:r>
-      <w:proofErr w:type="spellStart"/>
-      <w:r>
-        <w:rPr>
-          <w:lang w:val="en-US"/>
-        </w:rPr>
-        <w:t>SonarQube</w:t>
-      </w:r>
-      <w:proofErr w:type="spellEnd"/>
-      <w:r>
-        <w:rPr>
-          <w:lang w:val="en-US"/>
-        </w:rPr>
-        <w:t xml:space="preserve"> Analysis'){</w:t>
-      </w:r>
-    </w:p>
-    <w:p>
-      <w:pPr>
-        <w:rPr>
-          <w:lang w:val="en-US"/>
-        </w:rPr>
-      </w:pPr>
-      <w:r>
-        <w:rPr>
-          <w:lang w:val="en-US"/>
-        </w:rPr>
-        <w:t xml:space="preserve">          </w:t>
-      </w:r>
-      <w:proofErr w:type="gramStart"/>
-      <w:r>
-        <w:rPr>
-          <w:lang w:val="en-US"/>
-        </w:rPr>
-        <w:t>steps{</w:t>
-      </w:r>
-      <w:proofErr w:type="gramEnd"/>
-    </w:p>
-    <w:p>
-      <w:pPr>
-        <w:rPr>
-          <w:lang w:val="en-US"/>
-        </w:rPr>
-      </w:pPr>
-      <w:r>
-        <w:rPr>
-          <w:lang w:val="en-US"/>
-        </w:rPr>
-        <w:t xml:space="preserve">              </w:t>
-      </w:r>
-      <w:proofErr w:type="spellStart"/>
-      <w:r>
-        <w:rPr>
-          <w:lang w:val="en-US"/>
-        </w:rPr>
-        <w:t>withSonarQubeEnv</w:t>
-      </w:r>
-      <w:proofErr w:type="spellEnd"/>
-      <w:r>
-        <w:rPr>
-          <w:lang w:val="en-US"/>
-        </w:rPr>
-        <w:t>("${SONARQUBE_ENV}</w:t>
-      </w:r>
-      <w:proofErr w:type="gramStart"/>
-      <w:r>
-        <w:rPr>
-          <w:lang w:val="en-US"/>
-        </w:rPr>
-        <w:t>"){</w:t>
-      </w:r>
-      <w:proofErr w:type="gramEnd"/>
-    </w:p>
-    <w:p>
-      <w:pPr>
-        <w:rPr>
-          <w:lang w:val="en-US"/>
-        </w:rPr>
-      </w:pPr>
-      <w:r>
-        <w:rPr>
-          <w:lang w:val="en-US"/>
-        </w:rPr>
-        <w:t xml:space="preserve">                  </w:t>
-      </w:r>
-      <w:proofErr w:type="spellStart"/>
-      <w:r>
-        <w:rPr>
-          <w:lang w:val="en-US"/>
-        </w:rPr>
-        <w:t>sh</w:t>
-      </w:r>
-      <w:proofErr w:type="spellEnd"/>
-      <w:r>
-        <w:rPr>
-          <w:lang w:val="en-US"/>
-        </w:rPr>
-        <w:t xml:space="preserve">''' </w:t>
-      </w:r>
-    </w:p>
-    <w:p>
-      <w:pPr>
-        <w:rPr>
-          <w:lang w:val="en-US"/>
-        </w:rPr>
-      </w:pPr>
-      <w:r>
-        <w:rPr>
-          <w:lang w:val="en-US"/>
-        </w:rPr>
-        <w:t xml:space="preserve">                  /opt/sonar-scanner/bin/sonar-scanner\</w:t>
-      </w:r>
-    </w:p>
-    <w:p>
-      <w:pPr>
-        <w:rPr>
-          <w:lang w:val="en-US"/>
-        </w:rPr>
-      </w:pPr>
-      <w:r>
-        <w:rPr>
-          <w:lang w:val="en-US"/>
-        </w:rPr>
-        <w:t xml:space="preserve">                  -</w:t>
-      </w:r>
-      <w:proofErr w:type="spellStart"/>
-      <w:r>
-        <w:rPr>
-          <w:lang w:val="en-US"/>
-        </w:rPr>
-        <w:t>Dsonar.projectKey</w:t>
-      </w:r>
-      <w:proofErr w:type="spellEnd"/>
-      <w:r>
-        <w:rPr>
-          <w:lang w:val="en-US"/>
-        </w:rPr>
-        <w:t>=</w:t>
-      </w:r>
-      <w:proofErr w:type="spellStart"/>
-      <w:r>
-        <w:rPr>
-          <w:lang w:val="en-US"/>
-        </w:rPr>
-        <w:t>Sonar_Python</w:t>
-      </w:r>
-      <w:proofErr w:type="spellEnd"/>
-      <w:r>
-        <w:rPr>
-          <w:lang w:val="en-US"/>
-        </w:rPr>
-        <w:t>\</w:t>
-      </w:r>
-    </w:p>
-    <w:p>
-      <w:pPr>
-        <w:rPr>
-          <w:lang w:val="en-US"/>
-        </w:rPr>
-      </w:pPr>
-      <w:r>
-        <w:rPr>
-          <w:lang w:val="en-US"/>
-        </w:rPr>
-        <w:lastRenderedPageBreak/>
-        <w:t xml:space="preserve">                  -</w:t>
-      </w:r>
-      <w:proofErr w:type="spellStart"/>
-      <w:r>
-        <w:rPr>
-          <w:lang w:val="en-US"/>
-        </w:rPr>
-        <w:t>Dsonar.sources</w:t>
-      </w:r>
-      <w:proofErr w:type="spellEnd"/>
-      <w:r>
-        <w:rPr>
-          <w:lang w:val="en-US"/>
-        </w:rPr>
-        <w:t>=app \</w:t>
-      </w:r>
-    </w:p>
-    <w:p>
-      <w:pPr>
-        <w:rPr>
-          <w:lang w:val="en-US"/>
-        </w:rPr>
-      </w:pPr>
-      <w:r>
-        <w:rPr>
-          <w:lang w:val="en-US"/>
-        </w:rPr>
-        <w:t xml:space="preserve">                  -</w:t>
-      </w:r>
-      <w:proofErr w:type="spellStart"/>
-      <w:r>
-        <w:rPr>
-          <w:lang w:val="en-US"/>
-        </w:rPr>
-        <w:t>Dsonar.tests</w:t>
-      </w:r>
-      <w:proofErr w:type="spellEnd"/>
-      <w:r>
-        <w:rPr>
-          <w:lang w:val="en-US"/>
-        </w:rPr>
-        <w:t>=test \</w:t>
-      </w:r>
-    </w:p>
-    <w:p>
-      <w:pPr>
-        <w:rPr>
-          <w:lang w:val="en-US"/>
-        </w:rPr>
-      </w:pPr>
-      <w:r>
-        <w:rPr>
-          <w:lang w:val="en-US"/>
-        </w:rPr>
-        <w:t xml:space="preserve">                  -</w:t>
-      </w:r>
-      <w:proofErr w:type="spellStart"/>
-      <w:proofErr w:type="gramStart"/>
-      <w:r>
-        <w:rPr>
-          <w:lang w:val="en-US"/>
-        </w:rPr>
-        <w:t>Dsonar.python.version</w:t>
-      </w:r>
-      <w:proofErr w:type="spellEnd"/>
-      <w:proofErr w:type="gramEnd"/>
-      <w:r>
-        <w:rPr>
-          <w:lang w:val="en-US"/>
-        </w:rPr>
-        <w:t>=3.10 \</w:t>
-      </w:r>
-    </w:p>
-    <w:p>
-      <w:pPr>
-        <w:rPr>
-          <w:lang w:val="en-US"/>
-        </w:rPr>
-      </w:pPr>
-      <w:r>
-        <w:rPr>
-          <w:lang w:val="en-US"/>
-        </w:rPr>
-        <w:t xml:space="preserve">                  -</w:t>
-      </w:r>
-      <w:proofErr w:type="spellStart"/>
-      <w:r>
-        <w:rPr>
-          <w:lang w:val="en-US"/>
-        </w:rPr>
-        <w:t>Dsonar.token</w:t>
-      </w:r>
-      <w:proofErr w:type="spellEnd"/>
-      <w:r>
-        <w:rPr>
-          <w:lang w:val="en-US"/>
-        </w:rPr>
-        <w:t>={NEW_SONAR_TOKEN}</w:t>
-      </w:r>
-    </w:p>
-    <w:p>
-      <w:pPr>
-        <w:rPr>
-          <w:lang w:val="en-US"/>
-        </w:rPr>
-      </w:pPr>
-      <w:r>
-        <w:rPr>
-          <w:lang w:val="en-US"/>
-        </w:rPr>
-        <w:t xml:space="preserve">                  '''</w:t>
-      </w:r>
-    </w:p>
-    <w:p>
-      <w:pPr>
-        <w:rPr>
-          <w:lang w:val="en-US"/>
-        </w:rPr>
-      </w:pPr>
-      <w:r>
-        <w:rPr>
-          <w:lang w:val="en-US"/>
-        </w:rPr>
-        <w:t xml:space="preserve">              }</w:t>
-      </w:r>
-    </w:p>
-    <w:p>
-      <w:pPr>
-        <w:rPr>
-          <w:lang w:val="en-US"/>
-        </w:rPr>
-      </w:pPr>
-      <w:r>
-        <w:rPr>
-          <w:lang w:val="en-US"/>
-        </w:rPr>
-        <w:t xml:space="preserve">          }   </w:t>
-      </w:r>
-    </w:p>
-    <w:p>
-      <w:pPr>
-        <w:rPr>
-          <w:lang w:val="en-US"/>
-        </w:rPr>
-      </w:pPr>
-      <w:r>
-        <w:rPr>
-          <w:lang w:val="en-US"/>
-        </w:rPr>
-        <w:t xml:space="preserve">        }</w:t>
-      </w:r>
-    </w:p>
-    <w:p>
-      <w:pPr>
-        <w:rPr>
-          <w:lang w:val="en-US"/>
-        </w:rPr>
-      </w:pPr>
-      <w:r>
-        <w:rPr>
-          <w:lang w:val="en-US"/>
-        </w:rPr>
-        <w:t xml:space="preserve">    }</w:t>
-      </w:r>
-    </w:p>
-    <w:p>
-      <w:pPr>
-        <w:rPr>
-          <w:lang w:val="en-US"/>
-        </w:rPr>
-      </w:pPr>
-      <w:r>
-        <w:rPr>
-          <w:lang w:val="en-US"/>
-        </w:rPr>
-        <w:t>}</w:t>
-      </w:r>
     </w:p>
     <w:sectPr>
       <w:pgSz w:w="11906" w:h="16838"/>

</xml_diff>